<commit_message>
Informe: la incidencia de las tres politicas anota que el tope es de la licencia EVAL y no de la imagen
</commit_message>
<xml_diff>
--- a/informe/Grupo_05_Proyecto_Parte_I.docx
+++ b/informe/Grupo_05_Proyecto_Parte_I.docx
@@ -9884,7 +9884,7 @@
     </w:p>
     <w:p>
       <w:r>
-        <w:t>Al cargar el diseño de seis políticas, el FortiGate rechazó la cuarta con el mensaje de que se había alcanzado el máximo de entradas. Se midió el límite: acepta exactamente tres políticas, mientras que las rutas estáticas (cuatro) y las tres interfaces se aplicaron sin problema. Se rediseñó el conjunto fusionando políticas (sección 6.1). Al fusionarlas apareció una segunda restricción: FortiOS rechaza un VIP mezclado con un objeto normal en el destino de una política ("entry not found in datasource") y también un VIP con IP externa igual a la mapeada. La salida fue activar central NAT, de modo que el VIP solo traduzca y la política use la IP real. El cambio se verificó con las pruebas P01 a P07 y E01 a E16 sobre el plan B.</w:t>
+        <w:t xml:space="preserve">Al cargar el diseño de seis políticas, el FortiGate rechazó la cuarta con el mensaje de que se había alcanzado el máximo de entradas. Se midió el límite: acepta exactamente tres políticas, mientras que las rutas estáticas (cuatro) y las tres interfaces se aplicaron sin problema. Se rediseñó el conjunto fusionando políticas (sección 6.1). Al fusionarlas apareció una segunda restricción: FortiOS rechaza un VIP mezclado con un objeto normal en el destino de una política ("entry not found in datasource") y también un VIP con IP externa igual a la mapeada. La salida fue activar central NAT, de modo que el VIP solo traduzca y la política use la IP real. El cambio se verificó con las pruebas P01 a P07 y E01 a E16 sobre el plan B. El tope no depende de la imagen: la documentación de Fortinet describe la licencia de evaluación permanente con un máximo de tres interfaces, políticas y rutas (Fortinet, 2025), aunque en las pruebas solo las políticas llegaron al límite. Se confirmó repitiendo la prueba en FortiGate 7.6.7, que con su propia licencia de evaluación también rechazó la cuarta política. Cambiar de imagen no lo resuelve, y solo una licencia completa lo eliminaría.</w:t>
       </w:r>
     </w:p>
     <w:p>
@@ -10145,20 +10145,7 @@
         <w:rPr>
           <w:sz w:val="20"/>
         </w:rPr>
-        <w:t xml:space="preserve">Fortinet. (2025). </w:t>
-      </w:r>
-      <w:r>
-        <w:rPr>
-          <w:i/>
-          <w:sz w:val="20"/>
-        </w:rPr>
-        <w:t>FortiOS administration guide</w:t>
-      </w:r>
-      <w:r>
-        <w:rPr>
-          <w:sz w:val="20"/>
-        </w:rPr>
-        <w:t>. Fortinet Document Library. https://docs.fortinet.com/product/fortigate</w:t>
+        <w:t xml:space="preserve">Fortinet. (2025). FortiOS administration guide (secciones VM license y Permanent trial mode for FortiGate VM). Fortinet Document Library. https://docs.fortinet.com/product/fortigate</w:t>
       </w:r>
     </w:p>
     <w:p>

</xml_diff>

<commit_message>
Informe: revisión del Caso E, marcadores de captura con id, evidencia de políticas 2 y 3 y matriz de pruebas
</commit_message>
<xml_diff>
--- a/informe/Grupo_05_Proyecto_Parte_I.docx
+++ b/informe/Grupo_05_Proyecto_Parte_I.docx
@@ -113,9 +113,11 @@
       </w:pPr>
       <w:r>
         <w:rPr>
+          <w:b/>
           <w:sz w:val="24"/>
+          <w:highlight w:val="yellow"/>
         </w:rPr>
-        <w:t>[Nombre completo del integrante 1]</w:t>
+        <w:t>[DATO-NOMBRE-1: nombre completo del integrante 1]</w:t>
       </w:r>
     </w:p>
     <w:p>
@@ -125,9 +127,11 @@
       </w:pPr>
       <w:r>
         <w:rPr>
+          <w:b/>
           <w:sz w:val="24"/>
+          <w:highlight w:val="yellow"/>
         </w:rPr>
-        <w:t>[Nombre completo del integrante 2]</w:t>
+        <w:t>[DATO-NOMBRE-2: nombre completo del integrante 2]</w:t>
       </w:r>
     </w:p>
     <w:p>
@@ -137,9 +141,11 @@
       </w:pPr>
       <w:r>
         <w:rPr>
+          <w:b/>
           <w:sz w:val="24"/>
+          <w:highlight w:val="yellow"/>
         </w:rPr>
-        <w:t>[Nombre completo del integrante 3]</w:t>
+        <w:t>[DATO-NOMBRE-3: nombre completo del integrante 3]</w:t>
       </w:r>
     </w:p>
     <w:p>
@@ -149,9 +155,11 @@
       </w:pPr>
       <w:r>
         <w:rPr>
+          <w:b/>
           <w:sz w:val="24"/>
+          <w:highlight w:val="yellow"/>
         </w:rPr>
-        <w:t>[Nombre completo del integrante 4]</w:t>
+        <w:t>[DATO-NOMBRE-4: nombre completo del integrante 4]</w:t>
       </w:r>
     </w:p>
     <w:p/>
@@ -195,8 +203,9 @@
         <w:rPr>
           <w:b/>
           <w:sz w:val="22"/>
+          <w:highlight w:val="yellow"/>
         </w:rPr>
-        <w:t>[PENDIENTE: enlace de Drive]</w:t>
+        <w:t>[DATO-ENLACE-1: pegar el enlace de Drive de casoE_v1.gns3project]</w:t>
       </w:r>
     </w:p>
     <w:p>
@@ -648,17 +657,34 @@
         </w:rPr>
         <w:t>Anexo E. Proyecto GNS3</w:t>
       </w:r>
+    </w:p>
+    <w:p>
+      <w:pPr>
+        <w:spacing w:after="20" w:line="240" w:lineRule="auto"/>
+        <w:ind w:left="0"/>
+      </w:pPr>
+      <w:r>
+        <w:rPr>
+          <w:b/>
+          <w:sz w:val="20"/>
+        </w:rPr>
+        <w:t>Anexo F. Matriz de pruebas</w:t>
+      </w:r>
+    </w:p>
+    <w:p>
+      <w:pPr>
+        <w:spacing w:after="20" w:line="240" w:lineRule="auto"/>
+        <w:ind w:left="0"/>
+      </w:pPr>
+      <w:r>
+        <w:rPr>
+          <w:b/>
+          <w:sz w:val="20"/>
+        </w:rPr>
+        <w:t>Anexo G. Salidas del FortiGate</w:t>
+      </w:r>
       <w:r>
         <w:fldChar w:fldCharType="end"/>
-      </w:r>
-    </w:p>
-    <w:p>
-      <w:r>
-        <w:rPr>
-          <w:i/>
-          <w:sz w:val="17"/>
-        </w:rPr>
-        <w:t>Si los números de página no aparecen, haga clic derecho sobre el índice y elija Actualizar campo.</w:t>
       </w:r>
     </w:p>
     <w:p>
@@ -8176,6 +8202,11 @@
       </w:pPr>
     </w:p>
     <w:p>
+      <w:r>
+        <w:t>En FGT-01, la tabla confirma la ruta por defecto hacia R-EDGE, las redes de la LAN aprendidas por OSPF desde R-LAN, las redes conectadas y la ruta resumen hacia Null que descarta los destinos internos inexistentes (E15). La salida completa, del 27 de octubre de 2026, está en el Anexo G.</w:t>
+      </w:r>
+    </w:p>
+    <w:p>
       <w:pPr>
         <w:pStyle w:val="Heading2"/>
       </w:pPr>
@@ -8335,27 +8366,81 @@
       <w:tr>
         <w:tc>
           <w:tcPr>
-            <w:tcW w:type="dxa" w:w="7937"/>
+            <w:tcW w:type="dxa" w:w="8220"/>
             <w:shd w:val="clear" w:color="auto" w:fill="FFF2CC"/>
           </w:tcPr>
           <w:p>
             <w:pPr>
-              <w:spacing w:before="280" w:after="280"/>
-              <w:jc w:val="center"/>
+              <w:spacing w:before="60" w:after="60"/>
             </w:pPr>
             <w:r/>
             <w:r>
               <w:rPr>
                 <w:b/>
                 <w:sz w:val="19"/>
-              </w:rPr>
-              <w:t>[ESPACIO PARA CAPTURA]</w:t>
+                <w:highlight w:val="yellow"/>
+              </w:rPr>
+              <w:t>[CAP-01]</w:t>
             </w:r>
             <w:r>
               <w:rPr>
                 <w:sz w:val="19"/>
               </w:rPr>
-              <w:t xml:space="preserve"> Navegador de PC-EXT-WEB abriendo http://v4.g5.eif101o.test (página con IP cliente IPv4).</w:t>
+              <w:t xml:space="preserve"> Reemplazar este recuadro por la captura.</w:t>
+            </w:r>
+          </w:p>
+          <w:p>
+            <w:pPr>
+              <w:spacing w:before="60" w:after="60"/>
+            </w:pPr>
+            <w:r>
+              <w:rPr>
+                <w:b/>
+                <w:sz w:val="19"/>
+              </w:rPr>
+              <w:t>Dispositivo:</w:t>
+            </w:r>
+            <w:r>
+              <w:rPr>
+                <w:sz w:val="19"/>
+              </w:rPr>
+              <w:t xml:space="preserve"> PC-EXT-WEB (navegador del nodo, interfaz gráfica de GNS3)</w:t>
+            </w:r>
+          </w:p>
+          <w:p>
+            <w:pPr>
+              <w:spacing w:before="60" w:after="60"/>
+            </w:pPr>
+            <w:r>
+              <w:rPr>
+                <w:b/>
+                <w:sz w:val="19"/>
+              </w:rPr>
+              <w:t>Comando o acción:</w:t>
+            </w:r>
+            <w:r>
+              <w:rPr>
+                <w:sz w:val="19"/>
+              </w:rPr>
+              <w:t xml:space="preserve"> Abrir http://v4.g5.eif101o.test/ y dejar visible la barra de direcciones.</w:t>
+            </w:r>
+          </w:p>
+          <w:p>
+            <w:pPr>
+              <w:spacing w:before="60" w:after="60"/>
+            </w:pPr>
+            <w:r>
+              <w:rPr>
+                <w:b/>
+                <w:sz w:val="19"/>
+              </w:rPr>
+              <w:t>Debe verse:</w:t>
+            </w:r>
+            <w:r>
+              <w:rPr>
+                <w:sz w:val="19"/>
+              </w:rPr>
+              <w:t xml:space="preserve"> La página del grupo con la IP del cliente en IPv4, el nombre del servidor y los nombres de los integrantes.</w:t>
             </w:r>
           </w:p>
         </w:tc>
@@ -8377,7 +8462,7 @@
         <w:rPr>
           <w:sz w:val="19"/>
         </w:rPr>
-        <w:t xml:space="preserve"> Navegador de PC-EXT-WEB abriendo http://v4.g5.eif101o.test (página con IP cliente IPv4). Elaboración propia.</w:t>
+        <w:t xml:space="preserve"> Página del grupo abierta por IPv4. Elaboración propia.</w:t>
       </w:r>
     </w:p>
     <w:tbl>
@@ -8393,27 +8478,81 @@
       <w:tr>
         <w:tc>
           <w:tcPr>
-            <w:tcW w:type="dxa" w:w="7937"/>
+            <w:tcW w:type="dxa" w:w="8220"/>
             <w:shd w:val="clear" w:color="auto" w:fill="FFF2CC"/>
           </w:tcPr>
           <w:p>
             <w:pPr>
-              <w:spacing w:before="280" w:after="280"/>
-              <w:jc w:val="center"/>
+              <w:spacing w:before="60" w:after="60"/>
             </w:pPr>
             <w:r/>
             <w:r>
               <w:rPr>
                 <w:b/>
                 <w:sz w:val="19"/>
-              </w:rPr>
-              <w:t>[ESPACIO PARA CAPTURA]</w:t>
+                <w:highlight w:val="yellow"/>
+              </w:rPr>
+              <w:t>[CAP-02]</w:t>
             </w:r>
             <w:r>
               <w:rPr>
                 <w:sz w:val="19"/>
               </w:rPr>
-              <w:t xml:space="preserve"> Navegador de PC-EXT-WEB abriendo http://v6.g5.eif101o.test (página con IP cliente IPv6).</w:t>
+              <w:t xml:space="preserve"> Reemplazar este recuadro por la captura.</w:t>
+            </w:r>
+          </w:p>
+          <w:p>
+            <w:pPr>
+              <w:spacing w:before="60" w:after="60"/>
+            </w:pPr>
+            <w:r>
+              <w:rPr>
+                <w:b/>
+                <w:sz w:val="19"/>
+              </w:rPr>
+              <w:t>Dispositivo:</w:t>
+            </w:r>
+            <w:r>
+              <w:rPr>
+                <w:sz w:val="19"/>
+              </w:rPr>
+              <w:t xml:space="preserve"> PC-EXT-WEB (navegador del nodo, interfaz gráfica de GNS3)</w:t>
+            </w:r>
+          </w:p>
+          <w:p>
+            <w:pPr>
+              <w:spacing w:before="60" w:after="60"/>
+            </w:pPr>
+            <w:r>
+              <w:rPr>
+                <w:b/>
+                <w:sz w:val="19"/>
+              </w:rPr>
+              <w:t>Comando o acción:</w:t>
+            </w:r>
+            <w:r>
+              <w:rPr>
+                <w:sz w:val="19"/>
+              </w:rPr>
+              <w:t xml:space="preserve"> Abrir http://v6.g5.eif101o.test/ y dejar visible la barra de direcciones.</w:t>
+            </w:r>
+          </w:p>
+          <w:p>
+            <w:pPr>
+              <w:spacing w:before="60" w:after="60"/>
+            </w:pPr>
+            <w:r>
+              <w:rPr>
+                <w:b/>
+                <w:sz w:val="19"/>
+              </w:rPr>
+              <w:t>Debe verse:</w:t>
+            </w:r>
+            <w:r>
+              <w:rPr>
+                <w:sz w:val="19"/>
+              </w:rPr>
+              <w:t xml:space="preserve"> La misma página con la IP del cliente en IPv6 (prefijo 2001:db8:ffff:...).</w:t>
             </w:r>
           </w:p>
         </w:tc>
@@ -8435,7 +8574,7 @@
         <w:rPr>
           <w:sz w:val="19"/>
         </w:rPr>
-        <w:t xml:space="preserve"> Navegador de PC-EXT-WEB abriendo http://v6.g5.eif101o.test (página con IP cliente IPv6). Elaboración propia.</w:t>
+        <w:t xml:space="preserve"> Página del grupo abierta por IPv6. Elaboración propia.</w:t>
       </w:r>
     </w:p>
     <w:p>
@@ -8535,6 +8674,617 @@
         <w:t xml:space="preserve">  action="deny" policyid=0 service="HTTP" trandisp="dnat" tranip=10.50.1.34</w:t>
       </w:r>
     </w:p>
+    <w:p>
+      <w:pPr>
+        <w:spacing w:after="40"/>
+      </w:pPr>
+    </w:p>
+    <w:p>
+      <w:r>
+        <w:t xml:space="preserve">Las políticas 2 y 3 también quedan identificadas en el log. La política 2 procesó el SSH de PC-ADMIN al servidor (E04); la política 3, DENY-A-LAN, negó el ping externo a la LAN por IPv6 (E01) y el ping del servidor a PC-USER (E09). Una sesión TCP que el cliente cierra con RST aparece como </w:t>
+      </w:r>
+      <w:r>
+        <w:rPr>
+          <w:rFonts w:ascii="Consolas" w:hAnsi="Consolas" w:cs="Consolas" w:eastAsia="Consolas"/>
+          <w:sz w:val="20"/>
+        </w:rPr>
+        <w:t>client-rst</w:t>
+      </w:r>
+      <w:r>
+        <w:t xml:space="preserve"> y no es un fallo.</w:t>
+      </w:r>
+    </w:p>
+    <w:p>
+      <w:pPr>
+        <w:pStyle w:val="Codigo"/>
+      </w:pPr>
+      <w:r>
+        <w:t>srcip=10.50.1.10 srcintf="port2" dstip=10.50.1.34 dstport=22 dstintf="port3"</w:t>
+      </w:r>
+    </w:p>
+    <w:p>
+      <w:pPr>
+        <w:pStyle w:val="Codigo"/>
+      </w:pPr>
+      <w:r>
+        <w:t xml:space="preserve">  proto=6 action="client-rst" policyid=2</w:t>
+      </w:r>
+    </w:p>
+    <w:p>
+      <w:pPr>
+        <w:pStyle w:val="Codigo"/>
+      </w:pPr>
+      <w:r>
+        <w:t xml:space="preserve"> </w:t>
+      </w:r>
+    </w:p>
+    <w:p>
+      <w:pPr>
+        <w:pStyle w:val="Codigo"/>
+      </w:pPr>
+      <w:r>
+        <w:t>srcip=2001:db8:ffff:100::10 srcintf="port1" dstip=2001:db8:105:10::1 dstintf="port2"</w:t>
+      </w:r>
+    </w:p>
+    <w:p>
+      <w:pPr>
+        <w:pStyle w:val="Codigo"/>
+      </w:pPr>
+      <w:r>
+        <w:t xml:space="preserve">  proto=58 action="deny" policyid=3 policyname="DENY-A-LAN" service="PING6"</w:t>
+      </w:r>
+    </w:p>
+    <w:p>
+      <w:pPr>
+        <w:pStyle w:val="Codigo"/>
+      </w:pPr>
+      <w:r>
+        <w:t xml:space="preserve"> </w:t>
+      </w:r>
+    </w:p>
+    <w:p>
+      <w:pPr>
+        <w:pStyle w:val="Codigo"/>
+      </w:pPr>
+      <w:r>
+        <w:t>srcip=10.50.1.34 srcintf="port3" dstip=10.50.0.10 dstintf="port2"</w:t>
+      </w:r>
+    </w:p>
+    <w:p>
+      <w:pPr>
+        <w:pStyle w:val="Codigo"/>
+      </w:pPr>
+      <w:r>
+        <w:t xml:space="preserve">  proto=1 action="deny" policyid=3 policyname="DENY-A-LAN" service="PING"</w:t>
+      </w:r>
+    </w:p>
+    <w:p>
+      <w:pPr>
+        <w:spacing w:after="40"/>
+      </w:pPr>
+    </w:p>
+    <w:p>
+      <w:r>
+        <w:t>Los contadores de la tabla de políticas (</w:t>
+      </w:r>
+      <w:r>
+        <w:rPr>
+          <w:rFonts w:ascii="Consolas" w:hAnsi="Consolas" w:cs="Consolas" w:eastAsia="Consolas"/>
+          <w:sz w:val="20"/>
+        </w:rPr>
+        <w:t>diagnose firewall iprope show 100004 N</w:t>
+      </w:r>
+      <w:r>
+        <w:t xml:space="preserve"> para IPv4 e </w:t>
+      </w:r>
+      <w:r>
+        <w:rPr>
+          <w:rFonts w:ascii="Consolas" w:hAnsi="Consolas" w:cs="Consolas" w:eastAsia="Consolas"/>
+          <w:sz w:val="20"/>
+        </w:rPr>
+        <w:t>iprope6</w:t>
+      </w:r>
+      <w:r>
+        <w:t xml:space="preserve"> para IPv6) son la segunda evidencia que pide el enunciado: cada política acumula aciertos con la fecha del primero y del último. Son los de la sesión de pruebas del 27 de octubre de 2026; la salida de la política 3 está en el Anexo G.</w:t>
+      </w:r>
+    </w:p>
+    <w:p>
+      <w:pPr>
+        <w:pStyle w:val="Caption"/>
+        <w:keepNext/>
+        <w:spacing w:after="60"/>
+      </w:pPr>
+      <w:r>
+        <w:rPr>
+          <w:b/>
+          <w:sz w:val="19"/>
+        </w:rPr>
+        <w:t>Tabla 10.</w:t>
+      </w:r>
+      <w:r>
+        <w:rPr>
+          <w:sz w:val="19"/>
+        </w:rPr>
+        <w:t xml:space="preserve"> Aciertos acumulados por política en FGT-01.</w:t>
+      </w:r>
+    </w:p>
+    <w:tbl>
+      <w:tblPr>
+        <w:tblStyle w:val="TableGrid"/>
+        <w:tblW w:type="dxa" w:w="9524"/>
+        <w:jc w:val="center"/>
+        <w:tblLayout w:type="fixed"/>
+        <w:tblLook w:firstColumn="1" w:firstRow="1" w:lastColumn="0" w:lastRow="0" w:noHBand="0" w:noVBand="1" w:val="04A0"/>
+      </w:tblPr>
+      <w:tblGrid>
+        <w:gridCol w:w="907"/>
+        <w:gridCol w:w="3175"/>
+        <w:gridCol w:w="1361"/>
+        <w:gridCol w:w="1361"/>
+        <w:gridCol w:w="2721"/>
+      </w:tblGrid>
+      <w:tr>
+        <w:trPr>
+          <w:tblHeader w:val="true"/>
+          <w:cantSplit/>
+        </w:trPr>
+        <w:tc>
+          <w:tcPr>
+            <w:tcW w:type="dxa" w:w="907"/>
+            <w:shd w:val="clear" w:color="auto" w:fill="D9E2F3"/>
+          </w:tcPr>
+          <w:p>
+            <w:pPr>
+              <w:spacing w:after="20" w:before="20" w:line="240" w:lineRule="auto"/>
+            </w:pPr>
+            <w:r/>
+            <w:r>
+              <w:rPr>
+                <w:b/>
+                <w:sz w:val="18"/>
+              </w:rPr>
+              <w:t>Política</w:t>
+            </w:r>
+          </w:p>
+        </w:tc>
+        <w:tc>
+          <w:tcPr>
+            <w:tcW w:type="dxa" w:w="3175"/>
+            <w:shd w:val="clear" w:color="auto" w:fill="D9E2F3"/>
+          </w:tcPr>
+          <w:p>
+            <w:pPr>
+              <w:spacing w:after="20" w:before="20" w:line="240" w:lineRule="auto"/>
+            </w:pPr>
+            <w:r/>
+            <w:r>
+              <w:rPr>
+                <w:b/>
+                <w:sz w:val="18"/>
+              </w:rPr>
+              <w:t>Función</w:t>
+            </w:r>
+          </w:p>
+        </w:tc>
+        <w:tc>
+          <w:tcPr>
+            <w:tcW w:type="dxa" w:w="1361"/>
+            <w:shd w:val="clear" w:color="auto" w:fill="D9E2F3"/>
+          </w:tcPr>
+          <w:p>
+            <w:pPr>
+              <w:spacing w:after="20" w:before="20" w:line="240" w:lineRule="auto"/>
+            </w:pPr>
+            <w:r/>
+            <w:r>
+              <w:rPr>
+                <w:b/>
+                <w:sz w:val="18"/>
+              </w:rPr>
+              <w:t>Aciertos IPv4</w:t>
+            </w:r>
+          </w:p>
+        </w:tc>
+        <w:tc>
+          <w:tcPr>
+            <w:tcW w:type="dxa" w:w="1361"/>
+            <w:shd w:val="clear" w:color="auto" w:fill="D9E2F3"/>
+          </w:tcPr>
+          <w:p>
+            <w:pPr>
+              <w:spacing w:after="20" w:before="20" w:line="240" w:lineRule="auto"/>
+            </w:pPr>
+            <w:r/>
+            <w:r>
+              <w:rPr>
+                <w:b/>
+                <w:sz w:val="18"/>
+              </w:rPr>
+              <w:t>Aciertos IPv6</w:t>
+            </w:r>
+          </w:p>
+        </w:tc>
+        <w:tc>
+          <w:tcPr>
+            <w:tcW w:type="dxa" w:w="2721"/>
+            <w:shd w:val="clear" w:color="auto" w:fill="D9E2F3"/>
+          </w:tcPr>
+          <w:p>
+            <w:pPr>
+              <w:spacing w:after="20" w:before="20" w:line="240" w:lineRule="auto"/>
+            </w:pPr>
+            <w:r/>
+            <w:r>
+              <w:rPr>
+                <w:b/>
+                <w:sz w:val="18"/>
+              </w:rPr>
+              <w:t>Prueba que los explica</w:t>
+            </w:r>
+          </w:p>
+        </w:tc>
+      </w:tr>
+      <w:tr>
+        <w:trPr>
+          <w:cantSplit/>
+        </w:trPr>
+        <w:tc>
+          <w:tcPr>
+            <w:tcW w:type="dxa" w:w="907"/>
+          </w:tcPr>
+          <w:p>
+            <w:pPr>
+              <w:spacing w:after="20" w:before="20" w:line="240" w:lineRule="auto"/>
+            </w:pPr>
+            <w:r/>
+            <w:r>
+              <w:rPr>
+                <w:sz w:val="18"/>
+              </w:rPr>
+              <w:t>1</w:t>
+            </w:r>
+          </w:p>
+        </w:tc>
+        <w:tc>
+          <w:tcPr>
+            <w:tcW w:type="dxa" w:w="3175"/>
+          </w:tcPr>
+          <w:p>
+            <w:pPr>
+              <w:spacing w:after="20" w:before="20" w:line="240" w:lineRule="auto"/>
+            </w:pPr>
+            <w:r/>
+            <w:r>
+              <w:rPr>
+                <w:sz w:val="18"/>
+              </w:rPr>
+              <w:t>DNS-HTTP-A-DMZ (permitir)</w:t>
+            </w:r>
+          </w:p>
+        </w:tc>
+        <w:tc>
+          <w:tcPr>
+            <w:tcW w:type="dxa" w:w="1361"/>
+          </w:tcPr>
+          <w:p>
+            <w:pPr>
+              <w:spacing w:after="20" w:before="20" w:line="240" w:lineRule="auto"/>
+            </w:pPr>
+            <w:r/>
+            <w:r>
+              <w:rPr>
+                <w:sz w:val="18"/>
+              </w:rPr>
+              <w:t>157</w:t>
+            </w:r>
+          </w:p>
+        </w:tc>
+        <w:tc>
+          <w:tcPr>
+            <w:tcW w:type="dxa" w:w="1361"/>
+          </w:tcPr>
+          <w:p>
+            <w:pPr>
+              <w:spacing w:after="20" w:before="20" w:line="240" w:lineRule="auto"/>
+            </w:pPr>
+            <w:r/>
+            <w:r>
+              <w:rPr>
+                <w:sz w:val="18"/>
+              </w:rPr>
+              <w:t>158</w:t>
+            </w:r>
+          </w:p>
+        </w:tc>
+        <w:tc>
+          <w:tcPr>
+            <w:tcW w:type="dxa" w:w="2721"/>
+          </w:tcPr>
+          <w:p>
+            <w:pPr>
+              <w:spacing w:after="20" w:before="20" w:line="240" w:lineRule="auto"/>
+            </w:pPr>
+            <w:r/>
+            <w:r>
+              <w:rPr>
+                <w:sz w:val="18"/>
+              </w:rPr>
+              <w:t>P01 a P06 y E06</w:t>
+            </w:r>
+          </w:p>
+        </w:tc>
+      </w:tr>
+      <w:tr>
+        <w:trPr>
+          <w:cantSplit/>
+        </w:trPr>
+        <w:tc>
+          <w:tcPr>
+            <w:tcW w:type="dxa" w:w="907"/>
+          </w:tcPr>
+          <w:p>
+            <w:pPr>
+              <w:spacing w:after="20" w:before="20" w:line="240" w:lineRule="auto"/>
+            </w:pPr>
+            <w:r/>
+            <w:r>
+              <w:rPr>
+                <w:sz w:val="18"/>
+              </w:rPr>
+              <w:t>2</w:t>
+            </w:r>
+          </w:p>
+        </w:tc>
+        <w:tc>
+          <w:tcPr>
+            <w:tcW w:type="dxa" w:w="3175"/>
+          </w:tcPr>
+          <w:p>
+            <w:pPr>
+              <w:spacing w:after="20" w:before="20" w:line="240" w:lineRule="auto"/>
+            </w:pPr>
+            <w:r/>
+            <w:r>
+              <w:rPr>
+                <w:sz w:val="18"/>
+              </w:rPr>
+              <w:t>Administración SSH al servidor (permitir)</w:t>
+            </w:r>
+          </w:p>
+        </w:tc>
+        <w:tc>
+          <w:tcPr>
+            <w:tcW w:type="dxa" w:w="1361"/>
+          </w:tcPr>
+          <w:p>
+            <w:pPr>
+              <w:spacing w:after="20" w:before="20" w:line="240" w:lineRule="auto"/>
+            </w:pPr>
+            <w:r/>
+            <w:r>
+              <w:rPr>
+                <w:sz w:val="18"/>
+              </w:rPr>
+              <w:t>1</w:t>
+            </w:r>
+          </w:p>
+        </w:tc>
+        <w:tc>
+          <w:tcPr>
+            <w:tcW w:type="dxa" w:w="1361"/>
+          </w:tcPr>
+          <w:p>
+            <w:pPr>
+              <w:spacing w:after="20" w:before="20" w:line="240" w:lineRule="auto"/>
+            </w:pPr>
+            <w:r/>
+            <w:r>
+              <w:rPr>
+                <w:sz w:val="18"/>
+              </w:rPr>
+              <w:t>0</w:t>
+            </w:r>
+          </w:p>
+        </w:tc>
+        <w:tc>
+          <w:tcPr>
+            <w:tcW w:type="dxa" w:w="2721"/>
+          </w:tcPr>
+          <w:p>
+            <w:pPr>
+              <w:spacing w:after="20" w:before="20" w:line="240" w:lineRule="auto"/>
+            </w:pPr>
+            <w:r/>
+            <w:r>
+              <w:rPr>
+                <w:sz w:val="18"/>
+              </w:rPr>
+              <w:t>E04</w:t>
+            </w:r>
+          </w:p>
+        </w:tc>
+      </w:tr>
+      <w:tr>
+        <w:trPr>
+          <w:cantSplit/>
+        </w:trPr>
+        <w:tc>
+          <w:tcPr>
+            <w:tcW w:type="dxa" w:w="907"/>
+          </w:tcPr>
+          <w:p>
+            <w:pPr>
+              <w:spacing w:after="20" w:before="20" w:line="240" w:lineRule="auto"/>
+            </w:pPr>
+            <w:r/>
+            <w:r>
+              <w:rPr>
+                <w:sz w:val="18"/>
+              </w:rPr>
+              <w:t>3</w:t>
+            </w:r>
+          </w:p>
+        </w:tc>
+        <w:tc>
+          <w:tcPr>
+            <w:tcW w:type="dxa" w:w="3175"/>
+          </w:tcPr>
+          <w:p>
+            <w:pPr>
+              <w:spacing w:after="20" w:before="20" w:line="240" w:lineRule="auto"/>
+            </w:pPr>
+            <w:r/>
+            <w:r>
+              <w:rPr>
+                <w:sz w:val="18"/>
+              </w:rPr>
+              <w:t>DENY-A-LAN (denegar)</w:t>
+            </w:r>
+          </w:p>
+        </w:tc>
+        <w:tc>
+          <w:tcPr>
+            <w:tcW w:type="dxa" w:w="1361"/>
+          </w:tcPr>
+          <w:p>
+            <w:pPr>
+              <w:spacing w:after="20" w:before="20" w:line="240" w:lineRule="auto"/>
+            </w:pPr>
+            <w:r/>
+            <w:r>
+              <w:rPr>
+                <w:sz w:val="18"/>
+              </w:rPr>
+              <w:t>2</w:t>
+            </w:r>
+          </w:p>
+        </w:tc>
+        <w:tc>
+          <w:tcPr>
+            <w:tcW w:type="dxa" w:w="1361"/>
+          </w:tcPr>
+          <w:p>
+            <w:pPr>
+              <w:spacing w:after="20" w:before="20" w:line="240" w:lineRule="auto"/>
+            </w:pPr>
+            <w:r/>
+            <w:r>
+              <w:rPr>
+                <w:sz w:val="18"/>
+              </w:rPr>
+              <w:t>2</w:t>
+            </w:r>
+          </w:p>
+        </w:tc>
+        <w:tc>
+          <w:tcPr>
+            <w:tcW w:type="dxa" w:w="2721"/>
+          </w:tcPr>
+          <w:p>
+            <w:pPr>
+              <w:spacing w:after="20" w:before="20" w:line="240" w:lineRule="auto"/>
+            </w:pPr>
+            <w:r/>
+            <w:r>
+              <w:rPr>
+                <w:sz w:val="18"/>
+              </w:rPr>
+              <w:t>E09 por IPv4; E01 por IPv6</w:t>
+            </w:r>
+          </w:p>
+        </w:tc>
+      </w:tr>
+      <w:tr>
+        <w:trPr>
+          <w:cantSplit/>
+        </w:trPr>
+        <w:tc>
+          <w:tcPr>
+            <w:tcW w:type="dxa" w:w="907"/>
+          </w:tcPr>
+          <w:p>
+            <w:pPr>
+              <w:spacing w:after="20" w:before="20" w:line="240" w:lineRule="auto"/>
+            </w:pPr>
+            <w:r/>
+            <w:r>
+              <w:rPr>
+                <w:sz w:val="18"/>
+              </w:rPr>
+              <w:t>0</w:t>
+            </w:r>
+          </w:p>
+        </w:tc>
+        <w:tc>
+          <w:tcPr>
+            <w:tcW w:type="dxa" w:w="3175"/>
+          </w:tcPr>
+          <w:p>
+            <w:pPr>
+              <w:spacing w:after="20" w:before="20" w:line="240" w:lineRule="auto"/>
+            </w:pPr>
+            <w:r/>
+            <w:r>
+              <w:rPr>
+                <w:sz w:val="18"/>
+              </w:rPr>
+              <w:t>Denegación implícita</w:t>
+            </w:r>
+          </w:p>
+        </w:tc>
+        <w:tc>
+          <w:tcPr>
+            <w:tcW w:type="dxa" w:w="1361"/>
+          </w:tcPr>
+          <w:p>
+            <w:pPr>
+              <w:spacing w:after="20" w:before="20" w:line="240" w:lineRule="auto"/>
+            </w:pPr>
+            <w:r/>
+            <w:r>
+              <w:rPr>
+                <w:sz w:val="18"/>
+              </w:rPr>
+              <w:t>3</w:t>
+            </w:r>
+          </w:p>
+        </w:tc>
+        <w:tc>
+          <w:tcPr>
+            <w:tcW w:type="dxa" w:w="1361"/>
+          </w:tcPr>
+          <w:p>
+            <w:pPr>
+              <w:spacing w:after="20" w:before="20" w:line="240" w:lineRule="auto"/>
+            </w:pPr>
+            <w:r/>
+            <w:r>
+              <w:rPr>
+                <w:sz w:val="18"/>
+              </w:rPr>
+              <w:t>0</w:t>
+            </w:r>
+          </w:p>
+        </w:tc>
+        <w:tc>
+          <w:tcPr>
+            <w:tcW w:type="dxa" w:w="2721"/>
+          </w:tcPr>
+          <w:p>
+            <w:pPr>
+              <w:spacing w:after="20" w:before="20" w:line="240" w:lineRule="auto"/>
+            </w:pPr>
+            <w:r/>
+            <w:r>
+              <w:rPr>
+                <w:sz w:val="18"/>
+              </w:rPr>
+              <w:t>E03 (SSH externo)</w:t>
+            </w:r>
+          </w:p>
+        </w:tc>
+      </w:tr>
+    </w:tbl>
     <w:p>
       <w:pPr>
         <w:spacing w:after="40"/>
@@ -8553,27 +9303,81 @@
       <w:tr>
         <w:tc>
           <w:tcPr>
-            <w:tcW w:type="dxa" w:w="7937"/>
+            <w:tcW w:type="dxa" w:w="8220"/>
             <w:shd w:val="clear" w:color="auto" w:fill="FFF2CC"/>
           </w:tcPr>
           <w:p>
             <w:pPr>
-              <w:spacing w:before="280" w:after="280"/>
-              <w:jc w:val="center"/>
+              <w:spacing w:before="60" w:after="60"/>
             </w:pPr>
             <w:r/>
             <w:r>
               <w:rPr>
                 <w:b/>
                 <w:sz w:val="19"/>
-              </w:rPr>
-              <w:t>[ESPACIO PARA CAPTURA]</w:t>
+                <w:highlight w:val="yellow"/>
+              </w:rPr>
+              <w:t>[CAP-03]</w:t>
             </w:r>
             <w:r>
               <w:rPr>
                 <w:sz w:val="19"/>
               </w:rPr>
-              <w:t xml:space="preserve"> Consola web del FortiGate: Forward Traffic filtrado por política, con aceptadas y denegadas.</w:t>
+              <w:t xml:space="preserve"> Reemplazar este recuadro por la captura.</w:t>
+            </w:r>
+          </w:p>
+          <w:p>
+            <w:pPr>
+              <w:spacing w:before="60" w:after="60"/>
+            </w:pPr>
+            <w:r>
+              <w:rPr>
+                <w:b/>
+                <w:sz w:val="19"/>
+              </w:rPr>
+              <w:t>Dispositivo:</w:t>
+            </w:r>
+            <w:r>
+              <w:rPr>
+                <w:sz w:val="19"/>
+              </w:rPr>
+              <w:t xml:space="preserve"> PC-ADMIN, navegador web, hacia la GUI de FGT-01 (https://10.50.1.49, IP de port2)</w:t>
+            </w:r>
+          </w:p>
+          <w:p>
+            <w:pPr>
+              <w:spacing w:before="60" w:after="60"/>
+            </w:pPr>
+            <w:r>
+              <w:rPr>
+                <w:b/>
+                <w:sz w:val="19"/>
+              </w:rPr>
+              <w:t>Comando o acción:</w:t>
+            </w:r>
+            <w:r>
+              <w:rPr>
+                <w:sz w:val="19"/>
+              </w:rPr>
+              <w:t xml:space="preserve"> Log &amp; Report, Forward Traffic. Aplicar el filtro Policy ID = 1, luego 2, luego 3 y luego 0 (una captura o un montaje con las cuatro). Si no hay filas, repetir antes E01, E03, E04 y E09 de la matriz.</w:t>
+            </w:r>
+          </w:p>
+          <w:p>
+            <w:pPr>
+              <w:spacing w:before="60" w:after="60"/>
+            </w:pPr>
+            <w:r>
+              <w:rPr>
+                <w:b/>
+                <w:sz w:val="19"/>
+              </w:rPr>
+              <w:t>Debe verse:</w:t>
+            </w:r>
+            <w:r>
+              <w:rPr>
+                <w:sz w:val="19"/>
+              </w:rPr>
+              <w:t xml:space="preserve"> Columnas Source, Destination, Policy ID, Policy Name y Action. Debe verse Accept para las políticas 1 y 2, y Deny para la 3 (DENY-A-LAN) y la 0.</w:t>
             </w:r>
           </w:p>
         </w:tc>
@@ -8595,7 +9399,7 @@
         <w:rPr>
           <w:sz w:val="19"/>
         </w:rPr>
-        <w:t xml:space="preserve"> Consola web del FortiGate: Forward Traffic filtrado por política, con aceptadas y denegadas. Elaboración propia.</w:t>
+        <w:t xml:space="preserve"> Forward Traffic del FortiGate por política. Elaboración propia.</w:t>
       </w:r>
     </w:p>
     <w:p>
@@ -8617,7 +9421,7 @@
           <w:b/>
           <w:sz w:val="19"/>
         </w:rPr>
-        <w:t>Tabla 10.</w:t>
+        <w:t>Tabla 11.</w:t>
       </w:r>
       <w:r>
         <w:rPr>
@@ -9683,27 +10487,81 @@
       <w:tr>
         <w:tc>
           <w:tcPr>
-            <w:tcW w:type="dxa" w:w="7937"/>
+            <w:tcW w:type="dxa" w:w="8220"/>
             <w:shd w:val="clear" w:color="auto" w:fill="FFF2CC"/>
           </w:tcPr>
           <w:p>
             <w:pPr>
-              <w:spacing w:before="280" w:after="280"/>
-              <w:jc w:val="center"/>
+              <w:spacing w:before="60" w:after="60"/>
             </w:pPr>
             <w:r/>
             <w:r>
               <w:rPr>
                 <w:b/>
                 <w:sz w:val="19"/>
-              </w:rPr>
-              <w:t>[ESPACIO PARA CAPTURA]</w:t>
+                <w:highlight w:val="yellow"/>
+              </w:rPr>
+              <w:t>[CAP-04]</w:t>
             </w:r>
             <w:r>
               <w:rPr>
                 <w:sz w:val="19"/>
               </w:rPr>
-              <w:t xml:space="preserve"> Consola web del FortiGate abierta desde PC-ADMIN (prueba E13).</w:t>
+              <w:t xml:space="preserve"> Reemplazar este recuadro por la captura.</w:t>
+            </w:r>
+          </w:p>
+          <w:p>
+            <w:pPr>
+              <w:spacing w:before="60" w:after="60"/>
+            </w:pPr>
+            <w:r>
+              <w:rPr>
+                <w:b/>
+                <w:sz w:val="19"/>
+              </w:rPr>
+              <w:t>Dispositivo:</w:t>
+            </w:r>
+            <w:r>
+              <w:rPr>
+                <w:sz w:val="19"/>
+              </w:rPr>
+              <w:t xml:space="preserve"> PC-ADMIN, navegador web; y consola de PC-USER para el segundo comando</w:t>
+            </w:r>
+          </w:p>
+          <w:p>
+            <w:pPr>
+              <w:spacing w:before="60" w:after="60"/>
+            </w:pPr>
+            <w:r>
+              <w:rPr>
+                <w:b/>
+                <w:sz w:val="19"/>
+              </w:rPr>
+              <w:t>Comando o acción:</w:t>
+            </w:r>
+            <w:r>
+              <w:rPr>
+                <w:sz w:val="19"/>
+              </w:rPr>
+              <w:t xml:space="preserve"> En PC-ADMIN abrir https://10.50.1.49 e iniciar sesión. En PC-USER correr: curl -k -s -m 5 -o /dev/null -w gui=%{http_code} https://10.50.1.49</w:t>
+            </w:r>
+          </w:p>
+          <w:p>
+            <w:pPr>
+              <w:spacing w:before="60" w:after="60"/>
+            </w:pPr>
+            <w:r>
+              <w:rPr>
+                <w:b/>
+                <w:sz w:val="19"/>
+              </w:rPr>
+              <w:t>Debe verse:</w:t>
+            </w:r>
+            <w:r>
+              <w:rPr>
+                <w:sz w:val="19"/>
+              </w:rPr>
+              <w:t xml:space="preserve"> En PC-ADMIN, el Dashboard del FortiGate (gui=200). En PC-USER, la salida gui=000, que muestra el bloqueo por trusted hosts.</w:t>
             </w:r>
           </w:p>
         </w:tc>
@@ -9725,7 +10583,7 @@
         <w:rPr>
           <w:sz w:val="19"/>
         </w:rPr>
-        <w:t xml:space="preserve"> Consola web del FortiGate abierta desde PC-ADMIN (prueba E13). Elaboración propia.</w:t>
+        <w:t xml:space="preserve"> GUI del FortiGate abierta desde PC-ADMIN. Elaboración propia.</w:t>
       </w:r>
     </w:p>
     <w:p>
@@ -9884,7 +10742,7 @@
     </w:p>
     <w:p>
       <w:r>
-        <w:t xml:space="preserve">Al cargar el diseño de seis políticas, el FortiGate rechazó la cuarta con el mensaje de que se había alcanzado el máximo de entradas. Se midió el límite: acepta exactamente tres políticas, mientras que las rutas estáticas (cuatro) y las tres interfaces se aplicaron sin problema. Se rediseñó el conjunto fusionando políticas (sección 6.1). Al fusionarlas apareció una segunda restricción: FortiOS rechaza un VIP mezclado con un objeto normal en el destino de una política ("entry not found in datasource") y también un VIP con IP externa igual a la mapeada. La salida fue activar central NAT, de modo que el VIP solo traduzca y la política use la IP real. El cambio se verificó con las pruebas P01 a P07 y E01 a E16 sobre el plan B. El tope no depende de la imagen: la documentación de Fortinet describe la licencia de evaluación permanente con un máximo de tres interfaces, políticas y rutas (Fortinet, 2025), aunque en las pruebas solo las políticas llegaron al límite. Se confirmó repitiendo la prueba en FortiGate 7.6.7, que con su propia licencia de evaluación también rechazó la cuarta política. Cambiar de imagen no lo resuelve, y solo una licencia completa lo eliminaría.</w:t>
+        <w:t>Al cargar el diseño de seis políticas, el FortiGate rechazó la cuarta con el mensaje de que se había alcanzado el máximo de entradas. Se midió el límite: acepta exactamente tres políticas, mientras que las rutas estáticas (cuatro) y las tres interfaces se aplicaron sin problema. Se rediseñó el conjunto fusionando políticas (sección 6.1). Al fusionarlas apareció una segunda restricción: FortiOS rechaza un VIP mezclado con un objeto normal en el destino de una política ("entry not found in datasource") y también un VIP con IP externa igual a la mapeada. La salida fue activar central NAT, de modo que el VIP solo traduzca y la política use la IP real. El cambio se verificó con las pruebas P01 a P07 y E01 a E16 sobre el plan B.</w:t>
       </w:r>
     </w:p>
     <w:p>
@@ -9973,7 +10831,27 @@
     </w:p>
     <w:p>
       <w:r>
-        <w:t>La imagen de router disponible es un c7200, y no el IOSv que suponía el diseño, y sus interfaces no se llaman Gi0/N sino Gi(N+1)/0, de modo que los nombres del diseño no coincidían con los del equipo al cargar las configuraciones. Se documentó la equivalencia (Gi0/0 es Gi1/0; las subinterfaces de R-LAN son Gi2/0.10 y Gi2/0.20), se ajustaron los archivos de configuración y la matriz anota el nombre real.</w:t>
+        <w:t xml:space="preserve">La imagen de router disponible es un c7200, y no el IOSv que suponía el diseño, y sus interfaces no se llaman Gi0/N sino Gi(N+1)/0, de modo que los nombres del diseño no coincidían con los del equipo al cargar las configuraciones. Se documentó la equivalencia (Gi0/0 es Gi1/0; las subinterfaces de R-LAN son Gi2/0.10 y Gi2/0.20). Los archivos de </w:t>
+      </w:r>
+      <w:r>
+        <w:rPr>
+          <w:rFonts w:ascii="Consolas" w:hAnsi="Consolas" w:cs="Consolas" w:eastAsia="Consolas"/>
+          <w:sz w:val="20"/>
+        </w:rPr>
+        <w:t>configs/</w:t>
+      </w:r>
+      <w:r>
+        <w:t xml:space="preserve"> conservan los nombres Gi0/N del diseño y el script </w:t>
+      </w:r>
+      <w:r>
+        <w:rPr>
+          <w:rFonts w:ascii="Consolas" w:hAnsi="Consolas" w:cs="Consolas" w:eastAsia="Consolas"/>
+          <w:sz w:val="20"/>
+        </w:rPr>
+        <w:t>gns3ctl.py</w:t>
+      </w:r>
+      <w:r>
+        <w:t xml:space="preserve"> los traduce al cargarlos; la cabecera de cada archivo lo explica, y quien pegue las configuraciones a mano debe usar el nombre real del equipo. La matriz anota el nombre real.</w:t>
       </w:r>
     </w:p>
     <w:p>
@@ -10145,7 +11023,33 @@
         <w:rPr>
           <w:sz w:val="20"/>
         </w:rPr>
-        <w:t xml:space="preserve">Fortinet. (2025). FortiOS administration guide (secciones VM license y Permanent trial mode for FortiGate VM). Fortinet Document Library. https://docs.fortinet.com/product/fortigate</w:t>
+        <w:t xml:space="preserve">Fortinet. (2025). </w:t>
+      </w:r>
+      <w:r>
+        <w:rPr>
+          <w:i/>
+          <w:sz w:val="20"/>
+        </w:rPr>
+        <w:t>Permanent trial mode for FortiGate-VM</w:t>
+      </w:r>
+      <w:r>
+        <w:rPr>
+          <w:sz w:val="20"/>
+        </w:rPr>
+        <w:t xml:space="preserve">. En </w:t>
+      </w:r>
+      <w:r>
+        <w:rPr>
+          <w:i/>
+          <w:sz w:val="20"/>
+        </w:rPr>
+        <w:t>FortiOS 7.4.6 administration guide</w:t>
+      </w:r>
+      <w:r>
+        <w:rPr>
+          <w:sz w:val="20"/>
+        </w:rPr>
+        <w:t>. Fortinet Document Library. https://docs.fortinet.com/document/fortigate/7.4.6/administration-guide/441460</w:t>
       </w:r>
     </w:p>
     <w:p>
@@ -10457,7 +11361,23 @@
         <w:pStyle w:val="Codigo"/>
       </w:pPr>
       <w:r>
-        <w:t>! Fuente del diseño: docs/especificacion.md. Imagen: Cisco IOSv 15.x.</w:t>
+        <w:t>! Fuente del diseño: docs/especificacion.md. Imagen de la maqueta: Cisco c7200 (Dynamips).</w:t>
+      </w:r>
+    </w:p>
+    <w:p>
+      <w:pPr>
+        <w:pStyle w:val="Codigo"/>
+      </w:pPr>
+      <w:r>
+        <w:t>! Los nombres Gi0/N son los del diseño. En el c7200 la interfaz Gi0/N se llama Gi(N+1)/0: gns3ctl.py</w:t>
+      </w:r>
+    </w:p>
+    <w:p>
+      <w:pPr>
+        <w:pStyle w:val="Codigo"/>
+      </w:pPr>
+      <w:r>
+        <w:t>! los traduce al cargar, pero al pegar a mano hay que usar el nombre real (Gi0/0 es Gi1/0).</w:t>
       </w:r>
     </w:p>
     <w:p>
@@ -10998,7 +11918,23 @@
         <w:pStyle w:val="Codigo"/>
       </w:pPr>
       <w:r>
-        <w:t>! Fuente del diseño: docs/especificacion.md. Imagen: Cisco IOSv 15.x.</w:t>
+        <w:t>! Fuente del diseño: docs/especificacion.md. Imagen de la maqueta: Cisco c7200 (Dynamips).</w:t>
+      </w:r>
+    </w:p>
+    <w:p>
+      <w:pPr>
+        <w:pStyle w:val="Codigo"/>
+      </w:pPr>
+      <w:r>
+        <w:t>! Los nombres Gi0/N son los del diseño. En el c7200 la interfaz Gi0/N se llama Gi(N+1)/0: gns3ctl.py</w:t>
+      </w:r>
+    </w:p>
+    <w:p>
+      <w:pPr>
+        <w:pStyle w:val="Codigo"/>
+      </w:pPr>
+      <w:r>
+        <w:t>! los traduce al cargar, pero al pegar a mano hay que usar el nombre real (Gi0/0 es Gi1/0).</w:t>
       </w:r>
     </w:p>
     <w:p>
@@ -11819,7 +12755,23 @@
         <w:pStyle w:val="Codigo"/>
       </w:pPr>
       <w:r>
-        <w:t>! Fuente del diseño: docs/especificacion.md. Imagen: Cisco IOSv 15.x.</w:t>
+        <w:t>! Fuente del diseño: docs/especificacion.md. Imagen de la maqueta: Cisco c7200 (Dynamips).</w:t>
+      </w:r>
+    </w:p>
+    <w:p>
+      <w:pPr>
+        <w:pStyle w:val="Codigo"/>
+      </w:pPr>
+      <w:r>
+        <w:t>! Los nombres Gi0/N son los del diseño. En el c7200 la interfaz Gi0/N se llama Gi(N+1)/0: gns3ctl.py</w:t>
+      </w:r>
+    </w:p>
+    <w:p>
+      <w:pPr>
+        <w:pStyle w:val="Codigo"/>
+      </w:pPr>
+      <w:r>
+        <w:t>! los traduce al cargar, pero al pegar a mano hay que usar el nombre real (Gi0/1.10 es Gi2/0.10).</w:t>
       </w:r>
     </w:p>
     <w:p>
@@ -11923,7 +12875,7 @@
         <w:pStyle w:val="Codigo"/>
       </w:pPr>
       <w:r>
-        <w:t>! Tarda unos segundos: pegá esta línea sola y esperá el aviso "SSH 2.0 has been enabled" antes de seguir.</w:t>
+        <w:t>! Tarda unos segundos: pegue esta línea sola y espere el aviso "SSH 2.0 has been enabled" antes de seguir.</w:t>
       </w:r>
     </w:p>
     <w:p>
@@ -16160,8 +17112,9 @@
       <w:r>
         <w:rPr>
           <w:b/>
+          <w:highlight w:val="yellow"/>
         </w:rPr>
-        <w:t>[PENDIENTE: pegar aquí el enlace de Drive de casoE_v1.gns3project]</w:t>
+        <w:t>[DATO-ENLACE-2: pegar el mismo enlace de Drive]</w:t>
       </w:r>
       <w:r>
         <w:t>.</w:t>
@@ -16191,6 +17144,2453 @@
       <w:r>
         <w:t>.</w:t>
       </w:r>
+    </w:p>
+    <w:p>
+      <w:pPr>
+        <w:pStyle w:val="Heading1"/>
+      </w:pPr>
+      <w:r>
+        <w:t>Anexo F. Matriz de pruebas</w:t>
+      </w:r>
+    </w:p>
+    <w:p>
+      <w:r>
+        <w:t xml:space="preserve">Las 28 pruebas con el resultado esperado y el observado. La evidencia completa está en </w:t>
+      </w:r>
+      <w:r>
+        <w:rPr>
+          <w:rFonts w:ascii="Consolas" w:hAnsi="Consolas" w:cs="Consolas" w:eastAsia="Consolas"/>
+          <w:sz w:val="20"/>
+        </w:rPr>
+        <w:t>pruebas/evidencias/</w:t>
+      </w:r>
+      <w:r>
+        <w:t>.</w:t>
+      </w:r>
+    </w:p>
+    <w:p>
+      <w:pPr>
+        <w:pStyle w:val="Caption"/>
+        <w:keepNext/>
+        <w:spacing w:after="60"/>
+      </w:pPr>
+      <w:r>
+        <w:rPr>
+          <w:b/>
+          <w:sz w:val="19"/>
+        </w:rPr>
+        <w:t>Tabla 12.</w:t>
+      </w:r>
+      <w:r>
+        <w:rPr>
+          <w:sz w:val="19"/>
+        </w:rPr>
+        <w:t xml:space="preserve"> Matriz de pruebas del Caso E.</w:t>
+      </w:r>
+    </w:p>
+    <w:tbl>
+      <w:tblPr>
+        <w:tblStyle w:val="TableGrid"/>
+        <w:tblW w:type="dxa" w:w="9524"/>
+        <w:jc w:val="center"/>
+        <w:tblLayout w:type="fixed"/>
+        <w:tblLook w:firstColumn="1" w:firstRow="1" w:lastColumn="0" w:lastRow="0" w:noHBand="0" w:noVBand="1" w:val="04A0"/>
+      </w:tblPr>
+      <w:tblGrid>
+        <w:gridCol w:w="680"/>
+        <w:gridCol w:w="2721"/>
+        <w:gridCol w:w="2721"/>
+        <w:gridCol w:w="3402"/>
+      </w:tblGrid>
+      <w:tr>
+        <w:trPr>
+          <w:tblHeader w:val="true"/>
+          <w:cantSplit/>
+        </w:trPr>
+        <w:tc>
+          <w:tcPr>
+            <w:tcW w:type="dxa" w:w="680"/>
+            <w:shd w:val="clear" w:color="auto" w:fill="D9E2F3"/>
+          </w:tcPr>
+          <w:p>
+            <w:pPr>
+              <w:spacing w:after="20" w:before="20" w:line="240" w:lineRule="auto"/>
+            </w:pPr>
+            <w:r/>
+            <w:r>
+              <w:rPr>
+                <w:b/>
+                <w:sz w:val="17"/>
+              </w:rPr>
+              <w:t>ID</w:t>
+            </w:r>
+          </w:p>
+        </w:tc>
+        <w:tc>
+          <w:tcPr>
+            <w:tcW w:type="dxa" w:w="2721"/>
+            <w:shd w:val="clear" w:color="auto" w:fill="D9E2F3"/>
+          </w:tcPr>
+          <w:p>
+            <w:pPr>
+              <w:spacing w:after="20" w:before="20" w:line="240" w:lineRule="auto"/>
+            </w:pPr>
+            <w:r/>
+            <w:r>
+              <w:rPr>
+                <w:b/>
+                <w:sz w:val="17"/>
+              </w:rPr>
+              <w:t>Prueba</w:t>
+            </w:r>
+          </w:p>
+        </w:tc>
+        <w:tc>
+          <w:tcPr>
+            <w:tcW w:type="dxa" w:w="2721"/>
+            <w:shd w:val="clear" w:color="auto" w:fill="D9E2F3"/>
+          </w:tcPr>
+          <w:p>
+            <w:pPr>
+              <w:spacing w:after="20" w:before="20" w:line="240" w:lineRule="auto"/>
+            </w:pPr>
+            <w:r/>
+            <w:r>
+              <w:rPr>
+                <w:b/>
+                <w:sz w:val="17"/>
+              </w:rPr>
+              <w:t>Esperado</w:t>
+            </w:r>
+          </w:p>
+        </w:tc>
+        <w:tc>
+          <w:tcPr>
+            <w:tcW w:type="dxa" w:w="3402"/>
+            <w:shd w:val="clear" w:color="auto" w:fill="D9E2F3"/>
+          </w:tcPr>
+          <w:p>
+            <w:pPr>
+              <w:spacing w:after="20" w:before="20" w:line="240" w:lineRule="auto"/>
+            </w:pPr>
+            <w:r/>
+            <w:r>
+              <w:rPr>
+                <w:b/>
+                <w:sz w:val="17"/>
+              </w:rPr>
+              <w:t>Observado</w:t>
+            </w:r>
+          </w:p>
+        </w:tc>
+      </w:tr>
+      <w:tr>
+        <w:trPr>
+          <w:cantSplit/>
+        </w:trPr>
+        <w:tc>
+          <w:tcPr>
+            <w:tcW w:type="dxa" w:w="680"/>
+          </w:tcPr>
+          <w:p>
+            <w:pPr>
+              <w:spacing w:after="20" w:before="20" w:line="240" w:lineRule="auto"/>
+            </w:pPr>
+            <w:r/>
+            <w:r>
+              <w:rPr>
+                <w:sz w:val="17"/>
+              </w:rPr>
+              <w:t>P01</w:t>
+            </w:r>
+          </w:p>
+        </w:tc>
+        <w:tc>
+          <w:tcPr>
+            <w:tcW w:type="dxa" w:w="2721"/>
+          </w:tcPr>
+          <w:p>
+            <w:pPr>
+              <w:spacing w:after="20" w:before="20" w:line="240" w:lineRule="auto"/>
+            </w:pPr>
+            <w:r/>
+            <w:r>
+              <w:rPr>
+                <w:sz w:val="17"/>
+              </w:rPr>
+              <w:t>Registro A desde PC-EXT</w:t>
+            </w:r>
+          </w:p>
+        </w:tc>
+        <w:tc>
+          <w:tcPr>
+            <w:tcW w:type="dxa" w:w="2721"/>
+          </w:tcPr>
+          <w:p>
+            <w:pPr>
+              <w:spacing w:after="20" w:before="20" w:line="240" w:lineRule="auto"/>
+            </w:pPr>
+            <w:r/>
+            <w:r>
+              <w:rPr>
+                <w:sz w:val="17"/>
+              </w:rPr>
+              <w:t>203.0.113.20</w:t>
+            </w:r>
+          </w:p>
+        </w:tc>
+        <w:tc>
+          <w:tcPr>
+            <w:tcW w:type="dxa" w:w="3402"/>
+          </w:tcPr>
+          <w:p>
+            <w:pPr>
+              <w:spacing w:after="20" w:before="20" w:line="240" w:lineRule="auto"/>
+            </w:pPr>
+            <w:r/>
+            <w:r>
+              <w:rPr>
+                <w:sz w:val="17"/>
+              </w:rPr>
+              <w:t>203.0.113.20</w:t>
+            </w:r>
+          </w:p>
+        </w:tc>
+      </w:tr>
+      <w:tr>
+        <w:trPr>
+          <w:cantSplit/>
+        </w:trPr>
+        <w:tc>
+          <w:tcPr>
+            <w:tcW w:type="dxa" w:w="680"/>
+          </w:tcPr>
+          <w:p>
+            <w:pPr>
+              <w:spacing w:after="20" w:before="20" w:line="240" w:lineRule="auto"/>
+            </w:pPr>
+            <w:r/>
+            <w:r>
+              <w:rPr>
+                <w:sz w:val="17"/>
+              </w:rPr>
+              <w:t>P02</w:t>
+            </w:r>
+          </w:p>
+        </w:tc>
+        <w:tc>
+          <w:tcPr>
+            <w:tcW w:type="dxa" w:w="2721"/>
+          </w:tcPr>
+          <w:p>
+            <w:pPr>
+              <w:spacing w:after="20" w:before="20" w:line="240" w:lineRule="auto"/>
+            </w:pPr>
+            <w:r/>
+            <w:r>
+              <w:rPr>
+                <w:sz w:val="17"/>
+              </w:rPr>
+              <w:t>Registro AAAA desde PC-EXT</w:t>
+            </w:r>
+          </w:p>
+        </w:tc>
+        <w:tc>
+          <w:tcPr>
+            <w:tcW w:type="dxa" w:w="2721"/>
+          </w:tcPr>
+          <w:p>
+            <w:pPr>
+              <w:spacing w:after="20" w:before="20" w:line="240" w:lineRule="auto"/>
+            </w:pPr>
+            <w:r/>
+            <w:r>
+              <w:rPr>
+                <w:sz w:val="17"/>
+              </w:rPr>
+              <w:t>2001:db8:105:30::10</w:t>
+            </w:r>
+          </w:p>
+        </w:tc>
+        <w:tc>
+          <w:tcPr>
+            <w:tcW w:type="dxa" w:w="3402"/>
+          </w:tcPr>
+          <w:p>
+            <w:pPr>
+              <w:spacing w:after="20" w:before="20" w:line="240" w:lineRule="auto"/>
+            </w:pPr>
+            <w:r/>
+            <w:r>
+              <w:rPr>
+                <w:sz w:val="17"/>
+              </w:rPr>
+              <w:t>2001:db8:105:30::10</w:t>
+            </w:r>
+          </w:p>
+        </w:tc>
+      </w:tr>
+      <w:tr>
+        <w:trPr>
+          <w:cantSplit/>
+        </w:trPr>
+        <w:tc>
+          <w:tcPr>
+            <w:tcW w:type="dxa" w:w="680"/>
+          </w:tcPr>
+          <w:p>
+            <w:pPr>
+              <w:spacing w:after="20" w:before="20" w:line="240" w:lineRule="auto"/>
+            </w:pPr>
+            <w:r/>
+            <w:r>
+              <w:rPr>
+                <w:sz w:val="17"/>
+              </w:rPr>
+              <w:t>P03</w:t>
+            </w:r>
+          </w:p>
+        </w:tc>
+        <w:tc>
+          <w:tcPr>
+            <w:tcW w:type="dxa" w:w="2721"/>
+          </w:tcPr>
+          <w:p>
+            <w:pPr>
+              <w:spacing w:after="20" w:before="20" w:line="240" w:lineRule="auto"/>
+            </w:pPr>
+            <w:r/>
+            <w:r>
+              <w:rPr>
+                <w:sz w:val="17"/>
+              </w:rPr>
+              <w:t>Consulta DNS por IPv4</w:t>
+            </w:r>
+          </w:p>
+        </w:tc>
+        <w:tc>
+          <w:tcPr>
+            <w:tcW w:type="dxa" w:w="2721"/>
+          </w:tcPr>
+          <w:p>
+            <w:pPr>
+              <w:spacing w:after="20" w:before="20" w:line="240" w:lineRule="auto"/>
+            </w:pPr>
+            <w:r/>
+            <w:r>
+              <w:rPr>
+                <w:sz w:val="17"/>
+              </w:rPr>
+              <w:t>Respuesta autoritativa; política 1</w:t>
+            </w:r>
+          </w:p>
+        </w:tc>
+        <w:tc>
+          <w:tcPr>
+            <w:tcW w:type="dxa" w:w="3402"/>
+          </w:tcPr>
+          <w:p>
+            <w:pPr>
+              <w:spacing w:after="20" w:before="20" w:line="240" w:lineRule="auto"/>
+            </w:pPr>
+            <w:r/>
+            <w:r>
+              <w:rPr>
+                <w:sz w:val="17"/>
+              </w:rPr>
+              <w:t>Respuesta de la vista externa; accept en la política 1</w:t>
+            </w:r>
+          </w:p>
+        </w:tc>
+      </w:tr>
+      <w:tr>
+        <w:trPr>
+          <w:cantSplit/>
+        </w:trPr>
+        <w:tc>
+          <w:tcPr>
+            <w:tcW w:type="dxa" w:w="680"/>
+          </w:tcPr>
+          <w:p>
+            <w:pPr>
+              <w:spacing w:after="20" w:before="20" w:line="240" w:lineRule="auto"/>
+            </w:pPr>
+            <w:r/>
+            <w:r>
+              <w:rPr>
+                <w:sz w:val="17"/>
+              </w:rPr>
+              <w:t>P04</w:t>
+            </w:r>
+          </w:p>
+        </w:tc>
+        <w:tc>
+          <w:tcPr>
+            <w:tcW w:type="dxa" w:w="2721"/>
+          </w:tcPr>
+          <w:p>
+            <w:pPr>
+              <w:spacing w:after="20" w:before="20" w:line="240" w:lineRule="auto"/>
+            </w:pPr>
+            <w:r/>
+            <w:r>
+              <w:rPr>
+                <w:sz w:val="17"/>
+              </w:rPr>
+              <w:t>Consulta DNS por IPv6</w:t>
+            </w:r>
+          </w:p>
+        </w:tc>
+        <w:tc>
+          <w:tcPr>
+            <w:tcW w:type="dxa" w:w="2721"/>
+          </w:tcPr>
+          <w:p>
+            <w:pPr>
+              <w:spacing w:after="20" w:before="20" w:line="240" w:lineRule="auto"/>
+            </w:pPr>
+            <w:r/>
+            <w:r>
+              <w:rPr>
+                <w:sz w:val="17"/>
+              </w:rPr>
+              <w:t>Respuesta autoritativa; política 1</w:t>
+            </w:r>
+          </w:p>
+        </w:tc>
+        <w:tc>
+          <w:tcPr>
+            <w:tcW w:type="dxa" w:w="3402"/>
+          </w:tcPr>
+          <w:p>
+            <w:pPr>
+              <w:spacing w:after="20" w:before="20" w:line="240" w:lineRule="auto"/>
+            </w:pPr>
+            <w:r/>
+            <w:r>
+              <w:rPr>
+                <w:sz w:val="17"/>
+              </w:rPr>
+              <w:t>Respuesta de la vista externa; accept en la política 1</w:t>
+            </w:r>
+          </w:p>
+        </w:tc>
+      </w:tr>
+      <w:tr>
+        <w:trPr>
+          <w:cantSplit/>
+        </w:trPr>
+        <w:tc>
+          <w:tcPr>
+            <w:tcW w:type="dxa" w:w="680"/>
+          </w:tcPr>
+          <w:p>
+            <w:pPr>
+              <w:spacing w:after="20" w:before="20" w:line="240" w:lineRule="auto"/>
+            </w:pPr>
+            <w:r/>
+            <w:r>
+              <w:rPr>
+                <w:sz w:val="17"/>
+              </w:rPr>
+              <w:t>P05</w:t>
+            </w:r>
+          </w:p>
+        </w:tc>
+        <w:tc>
+          <w:tcPr>
+            <w:tcW w:type="dxa" w:w="2721"/>
+          </w:tcPr>
+          <w:p>
+            <w:pPr>
+              <w:spacing w:after="20" w:before="20" w:line="240" w:lineRule="auto"/>
+            </w:pPr>
+            <w:r/>
+            <w:r>
+              <w:rPr>
+                <w:sz w:val="17"/>
+              </w:rPr>
+              <w:t>HTTP por IPv4 con nombre</w:t>
+            </w:r>
+          </w:p>
+        </w:tc>
+        <w:tc>
+          <w:tcPr>
+            <w:tcW w:type="dxa" w:w="2721"/>
+          </w:tcPr>
+          <w:p>
+            <w:pPr>
+              <w:spacing w:after="20" w:before="20" w:line="240" w:lineRule="auto"/>
+            </w:pPr>
+            <w:r/>
+            <w:r>
+              <w:rPr>
+                <w:sz w:val="17"/>
+              </w:rPr>
+              <w:t>HTTP 200, IP de cliente IPv4</w:t>
+            </w:r>
+          </w:p>
+        </w:tc>
+        <w:tc>
+          <w:tcPr>
+            <w:tcW w:type="dxa" w:w="3402"/>
+          </w:tcPr>
+          <w:p>
+            <w:pPr>
+              <w:spacing w:after="20" w:before="20" w:line="240" w:lineRule="auto"/>
+            </w:pPr>
+            <w:r/>
+            <w:r>
+              <w:rPr>
+                <w:sz w:val="17"/>
+              </w:rPr>
+              <w:t>http4=200</w:t>
+            </w:r>
+          </w:p>
+        </w:tc>
+      </w:tr>
+      <w:tr>
+        <w:trPr>
+          <w:cantSplit/>
+        </w:trPr>
+        <w:tc>
+          <w:tcPr>
+            <w:tcW w:type="dxa" w:w="680"/>
+          </w:tcPr>
+          <w:p>
+            <w:pPr>
+              <w:spacing w:after="20" w:before="20" w:line="240" w:lineRule="auto"/>
+            </w:pPr>
+            <w:r/>
+            <w:r>
+              <w:rPr>
+                <w:sz w:val="17"/>
+              </w:rPr>
+              <w:t>P06</w:t>
+            </w:r>
+          </w:p>
+        </w:tc>
+        <w:tc>
+          <w:tcPr>
+            <w:tcW w:type="dxa" w:w="2721"/>
+          </w:tcPr>
+          <w:p>
+            <w:pPr>
+              <w:spacing w:after="20" w:before="20" w:line="240" w:lineRule="auto"/>
+            </w:pPr>
+            <w:r/>
+            <w:r>
+              <w:rPr>
+                <w:sz w:val="17"/>
+              </w:rPr>
+              <w:t>HTTP por IPv6 con nombre</w:t>
+            </w:r>
+          </w:p>
+        </w:tc>
+        <w:tc>
+          <w:tcPr>
+            <w:tcW w:type="dxa" w:w="2721"/>
+          </w:tcPr>
+          <w:p>
+            <w:pPr>
+              <w:spacing w:after="20" w:before="20" w:line="240" w:lineRule="auto"/>
+            </w:pPr>
+            <w:r/>
+            <w:r>
+              <w:rPr>
+                <w:sz w:val="17"/>
+              </w:rPr>
+              <w:t>HTTP 200, IP de cliente IPv6</w:t>
+            </w:r>
+          </w:p>
+        </w:tc>
+        <w:tc>
+          <w:tcPr>
+            <w:tcW w:type="dxa" w:w="3402"/>
+          </w:tcPr>
+          <w:p>
+            <w:pPr>
+              <w:spacing w:after="20" w:before="20" w:line="240" w:lineRule="auto"/>
+            </w:pPr>
+            <w:r/>
+            <w:r>
+              <w:rPr>
+                <w:sz w:val="17"/>
+              </w:rPr>
+              <w:t>http6=200</w:t>
+            </w:r>
+          </w:p>
+        </w:tc>
+      </w:tr>
+      <w:tr>
+        <w:trPr>
+          <w:cantSplit/>
+        </w:trPr>
+        <w:tc>
+          <w:tcPr>
+            <w:tcW w:type="dxa" w:w="680"/>
+          </w:tcPr>
+          <w:p>
+            <w:pPr>
+              <w:spacing w:after="20" w:before="20" w:line="240" w:lineRule="auto"/>
+            </w:pPr>
+            <w:r/>
+            <w:r>
+              <w:rPr>
+                <w:sz w:val="17"/>
+              </w:rPr>
+              <w:t>P07</w:t>
+            </w:r>
+          </w:p>
+        </w:tc>
+        <w:tc>
+          <w:tcPr>
+            <w:tcW w:type="dxa" w:w="2721"/>
+          </w:tcPr>
+          <w:p>
+            <w:pPr>
+              <w:spacing w:after="20" w:before="20" w:line="240" w:lineRule="auto"/>
+            </w:pPr>
+            <w:r/>
+            <w:r>
+              <w:rPr>
+                <w:sz w:val="17"/>
+              </w:rPr>
+              <w:t>Política permitida y denegada</w:t>
+            </w:r>
+          </w:p>
+        </w:tc>
+        <w:tc>
+          <w:tcPr>
+            <w:tcW w:type="dxa" w:w="2721"/>
+          </w:tcPr>
+          <w:p>
+            <w:pPr>
+              <w:spacing w:after="20" w:before="20" w:line="240" w:lineRule="auto"/>
+            </w:pPr>
+            <w:r/>
+            <w:r>
+              <w:rPr>
+                <w:sz w:val="17"/>
+              </w:rPr>
+              <w:t>P05 permitida y E01 denegada</w:t>
+            </w:r>
+          </w:p>
+        </w:tc>
+        <w:tc>
+          <w:tcPr>
+            <w:tcW w:type="dxa" w:w="3402"/>
+          </w:tcPr>
+          <w:p>
+            <w:pPr>
+              <w:spacing w:after="20" w:before="20" w:line="240" w:lineRule="auto"/>
+            </w:pPr>
+            <w:r/>
+            <w:r>
+              <w:rPr>
+                <w:sz w:val="17"/>
+              </w:rPr>
+              <w:t>Política 1 acepta; política 3 deniega</w:t>
+            </w:r>
+          </w:p>
+        </w:tc>
+      </w:tr>
+      <w:tr>
+        <w:trPr>
+          <w:cantSplit/>
+        </w:trPr>
+        <w:tc>
+          <w:tcPr>
+            <w:tcW w:type="dxa" w:w="680"/>
+          </w:tcPr>
+          <w:p>
+            <w:pPr>
+              <w:spacing w:after="20" w:before="20" w:line="240" w:lineRule="auto"/>
+            </w:pPr>
+            <w:r/>
+            <w:r>
+              <w:rPr>
+                <w:sz w:val="17"/>
+              </w:rPr>
+              <w:t>E01</w:t>
+            </w:r>
+          </w:p>
+        </w:tc>
+        <w:tc>
+          <w:tcPr>
+            <w:tcW w:type="dxa" w:w="2721"/>
+          </w:tcPr>
+          <w:p>
+            <w:pPr>
+              <w:spacing w:after="20" w:before="20" w:line="240" w:lineRule="auto"/>
+            </w:pPr>
+            <w:r/>
+            <w:r>
+              <w:rPr>
+                <w:sz w:val="17"/>
+              </w:rPr>
+              <w:t>Externo hacia LAN por IPv6</w:t>
+            </w:r>
+          </w:p>
+        </w:tc>
+        <w:tc>
+          <w:tcPr>
+            <w:tcW w:type="dxa" w:w="2721"/>
+          </w:tcPr>
+          <w:p>
+            <w:pPr>
+              <w:spacing w:after="20" w:before="20" w:line="240" w:lineRule="auto"/>
+            </w:pPr>
+            <w:r/>
+            <w:r>
+              <w:rPr>
+                <w:sz w:val="17"/>
+              </w:rPr>
+              <w:t>Bloqueado</w:t>
+            </w:r>
+          </w:p>
+        </w:tc>
+        <w:tc>
+          <w:tcPr>
+            <w:tcW w:type="dxa" w:w="3402"/>
+          </w:tcPr>
+          <w:p>
+            <w:pPr>
+              <w:spacing w:after="20" w:before="20" w:line="240" w:lineRule="auto"/>
+            </w:pPr>
+            <w:r/>
+            <w:r>
+              <w:rPr>
+                <w:sz w:val="17"/>
+              </w:rPr>
+              <w:t>100% de pérdida; política 3</w:t>
+            </w:r>
+          </w:p>
+        </w:tc>
+      </w:tr>
+      <w:tr>
+        <w:trPr>
+          <w:cantSplit/>
+        </w:trPr>
+        <w:tc>
+          <w:tcPr>
+            <w:tcW w:type="dxa" w:w="680"/>
+          </w:tcPr>
+          <w:p>
+            <w:pPr>
+              <w:spacing w:after="20" w:before="20" w:line="240" w:lineRule="auto"/>
+            </w:pPr>
+            <w:r/>
+            <w:r>
+              <w:rPr>
+                <w:sz w:val="17"/>
+              </w:rPr>
+              <w:t>E02</w:t>
+            </w:r>
+          </w:p>
+        </w:tc>
+        <w:tc>
+          <w:tcPr>
+            <w:tcW w:type="dxa" w:w="2721"/>
+          </w:tcPr>
+          <w:p>
+            <w:pPr>
+              <w:spacing w:after="20" w:before="20" w:line="240" w:lineRule="auto"/>
+            </w:pPr>
+            <w:r/>
+            <w:r>
+              <w:rPr>
+                <w:sz w:val="17"/>
+              </w:rPr>
+              <w:t>Externo hacia LAN por IPv4</w:t>
+            </w:r>
+          </w:p>
+        </w:tc>
+        <w:tc>
+          <w:tcPr>
+            <w:tcW w:type="dxa" w:w="2721"/>
+          </w:tcPr>
+          <w:p>
+            <w:pPr>
+              <w:spacing w:after="20" w:before="20" w:line="240" w:lineRule="auto"/>
+            </w:pPr>
+            <w:r/>
+            <w:r>
+              <w:rPr>
+                <w:sz w:val="17"/>
+              </w:rPr>
+              <w:t>Sin ruta</w:t>
+            </w:r>
+          </w:p>
+        </w:tc>
+        <w:tc>
+          <w:tcPr>
+            <w:tcW w:type="dxa" w:w="3402"/>
+          </w:tcPr>
+          <w:p>
+            <w:pPr>
+              <w:spacing w:after="20" w:before="20" w:line="240" w:lineRule="auto"/>
+            </w:pPr>
+            <w:r/>
+            <w:r>
+              <w:rPr>
+                <w:sz w:val="17"/>
+              </w:rPr>
+              <w:t>Destination Host Unreachable desde R-ISP</w:t>
+            </w:r>
+          </w:p>
+        </w:tc>
+      </w:tr>
+      <w:tr>
+        <w:trPr>
+          <w:cantSplit/>
+        </w:trPr>
+        <w:tc>
+          <w:tcPr>
+            <w:tcW w:type="dxa" w:w="680"/>
+          </w:tcPr>
+          <w:p>
+            <w:pPr>
+              <w:spacing w:after="20" w:before="20" w:line="240" w:lineRule="auto"/>
+            </w:pPr>
+            <w:r/>
+            <w:r>
+              <w:rPr>
+                <w:sz w:val="17"/>
+              </w:rPr>
+              <w:t>E02b</w:t>
+            </w:r>
+          </w:p>
+        </w:tc>
+        <w:tc>
+          <w:tcPr>
+            <w:tcW w:type="dxa" w:w="2721"/>
+          </w:tcPr>
+          <w:p>
+            <w:pPr>
+              <w:spacing w:after="20" w:before="20" w:line="240" w:lineRule="auto"/>
+            </w:pPr>
+            <w:r/>
+            <w:r>
+              <w:rPr>
+                <w:sz w:val="17"/>
+              </w:rPr>
+              <w:t>Igual, con ruta temporal</w:t>
+            </w:r>
+          </w:p>
+        </w:tc>
+        <w:tc>
+          <w:tcPr>
+            <w:tcW w:type="dxa" w:w="2721"/>
+          </w:tcPr>
+          <w:p>
+            <w:pPr>
+              <w:spacing w:after="20" w:before="20" w:line="240" w:lineRule="auto"/>
+            </w:pPr>
+            <w:r/>
+            <w:r>
+              <w:rPr>
+                <w:sz w:val="17"/>
+              </w:rPr>
+              <w:t>Bloqueado en el FortiGate</w:t>
+            </w:r>
+          </w:p>
+        </w:tc>
+        <w:tc>
+          <w:tcPr>
+            <w:tcW w:type="dxa" w:w="3402"/>
+          </w:tcPr>
+          <w:p>
+            <w:pPr>
+              <w:spacing w:after="20" w:before="20" w:line="240" w:lineRule="auto"/>
+            </w:pPr>
+            <w:r/>
+            <w:r>
+              <w:rPr>
+                <w:sz w:val="17"/>
+              </w:rPr>
+              <w:t>Se deniega en port1</w:t>
+            </w:r>
+          </w:p>
+        </w:tc>
+      </w:tr>
+      <w:tr>
+        <w:trPr>
+          <w:cantSplit/>
+        </w:trPr>
+        <w:tc>
+          <w:tcPr>
+            <w:tcW w:type="dxa" w:w="680"/>
+          </w:tcPr>
+          <w:p>
+            <w:pPr>
+              <w:spacing w:after="20" w:before="20" w:line="240" w:lineRule="auto"/>
+            </w:pPr>
+            <w:r/>
+            <w:r>
+              <w:rPr>
+                <w:sz w:val="17"/>
+              </w:rPr>
+              <w:t>E03</w:t>
+            </w:r>
+          </w:p>
+        </w:tc>
+        <w:tc>
+          <w:tcPr>
+            <w:tcW w:type="dxa" w:w="2721"/>
+          </w:tcPr>
+          <w:p>
+            <w:pPr>
+              <w:spacing w:after="20" w:before="20" w:line="240" w:lineRule="auto"/>
+            </w:pPr>
+            <w:r/>
+            <w:r>
+              <w:rPr>
+                <w:sz w:val="17"/>
+              </w:rPr>
+              <w:t>SSH externo al servidor</w:t>
+            </w:r>
+          </w:p>
+        </w:tc>
+        <w:tc>
+          <w:tcPr>
+            <w:tcW w:type="dxa" w:w="2721"/>
+          </w:tcPr>
+          <w:p>
+            <w:pPr>
+              <w:spacing w:after="20" w:before="20" w:line="240" w:lineRule="auto"/>
+            </w:pPr>
+            <w:r/>
+            <w:r>
+              <w:rPr>
+                <w:sz w:val="17"/>
+              </w:rPr>
+              <w:t>Denegación implícita</w:t>
+            </w:r>
+          </w:p>
+        </w:tc>
+        <w:tc>
+          <w:tcPr>
+            <w:tcW w:type="dxa" w:w="3402"/>
+          </w:tcPr>
+          <w:p>
+            <w:pPr>
+              <w:spacing w:after="20" w:before="20" w:line="240" w:lineRule="auto"/>
+            </w:pPr>
+            <w:r/>
+            <w:r>
+              <w:rPr>
+                <w:sz w:val="17"/>
+              </w:rPr>
+              <w:t>Timeout; política 0</w:t>
+            </w:r>
+          </w:p>
+        </w:tc>
+      </w:tr>
+      <w:tr>
+        <w:trPr>
+          <w:cantSplit/>
+        </w:trPr>
+        <w:tc>
+          <w:tcPr>
+            <w:tcW w:type="dxa" w:w="680"/>
+          </w:tcPr>
+          <w:p>
+            <w:pPr>
+              <w:spacing w:after="20" w:before="20" w:line="240" w:lineRule="auto"/>
+            </w:pPr>
+            <w:r/>
+            <w:r>
+              <w:rPr>
+                <w:sz w:val="17"/>
+              </w:rPr>
+              <w:t>E04</w:t>
+            </w:r>
+          </w:p>
+        </w:tc>
+        <w:tc>
+          <w:tcPr>
+            <w:tcW w:type="dxa" w:w="2721"/>
+          </w:tcPr>
+          <w:p>
+            <w:pPr>
+              <w:spacing w:after="20" w:before="20" w:line="240" w:lineRule="auto"/>
+            </w:pPr>
+            <w:r/>
+            <w:r>
+              <w:rPr>
+                <w:sz w:val="17"/>
+              </w:rPr>
+              <w:t>PC-ADMIN por SSH al servidor</w:t>
+            </w:r>
+          </w:p>
+        </w:tc>
+        <w:tc>
+          <w:tcPr>
+            <w:tcW w:type="dxa" w:w="2721"/>
+          </w:tcPr>
+          <w:p>
+            <w:pPr>
+              <w:spacing w:after="20" w:before="20" w:line="240" w:lineRule="auto"/>
+            </w:pPr>
+            <w:r/>
+            <w:r>
+              <w:rPr>
+                <w:sz w:val="17"/>
+              </w:rPr>
+              <w:t>Conecta</w:t>
+            </w:r>
+          </w:p>
+        </w:tc>
+        <w:tc>
+          <w:tcPr>
+            <w:tcW w:type="dxa" w:w="3402"/>
+          </w:tcPr>
+          <w:p>
+            <w:pPr>
+              <w:spacing w:after="20" w:before="20" w:line="240" w:lineRule="auto"/>
+            </w:pPr>
+            <w:r/>
+            <w:r>
+              <w:rPr>
+                <w:sz w:val="17"/>
+              </w:rPr>
+              <w:t>Puerto 22 abierto; política 2</w:t>
+            </w:r>
+          </w:p>
+        </w:tc>
+      </w:tr>
+      <w:tr>
+        <w:trPr>
+          <w:cantSplit/>
+        </w:trPr>
+        <w:tc>
+          <w:tcPr>
+            <w:tcW w:type="dxa" w:w="680"/>
+          </w:tcPr>
+          <w:p>
+            <w:pPr>
+              <w:spacing w:after="20" w:before="20" w:line="240" w:lineRule="auto"/>
+            </w:pPr>
+            <w:r/>
+            <w:r>
+              <w:rPr>
+                <w:sz w:val="17"/>
+              </w:rPr>
+              <w:t>E05</w:t>
+            </w:r>
+          </w:p>
+        </w:tc>
+        <w:tc>
+          <w:tcPr>
+            <w:tcW w:type="dxa" w:w="2721"/>
+          </w:tcPr>
+          <w:p>
+            <w:pPr>
+              <w:spacing w:after="20" w:before="20" w:line="240" w:lineRule="auto"/>
+            </w:pPr>
+            <w:r/>
+            <w:r>
+              <w:rPr>
+                <w:sz w:val="17"/>
+              </w:rPr>
+              <w:t>PC-USER por SSH al servidor</w:t>
+            </w:r>
+          </w:p>
+        </w:tc>
+        <w:tc>
+          <w:tcPr>
+            <w:tcW w:type="dxa" w:w="2721"/>
+          </w:tcPr>
+          <w:p>
+            <w:pPr>
+              <w:spacing w:after="20" w:before="20" w:line="240" w:lineRule="auto"/>
+            </w:pPr>
+            <w:r/>
+            <w:r>
+              <w:rPr>
+                <w:sz w:val="17"/>
+              </w:rPr>
+              <w:t>Denegación implícita</w:t>
+            </w:r>
+          </w:p>
+        </w:tc>
+        <w:tc>
+          <w:tcPr>
+            <w:tcW w:type="dxa" w:w="3402"/>
+          </w:tcPr>
+          <w:p>
+            <w:pPr>
+              <w:spacing w:after="20" w:before="20" w:line="240" w:lineRule="auto"/>
+            </w:pPr>
+            <w:r/>
+            <w:r>
+              <w:rPr>
+                <w:sz w:val="17"/>
+              </w:rPr>
+              <w:t>Timeout</w:t>
+            </w:r>
+          </w:p>
+        </w:tc>
+      </w:tr>
+      <w:tr>
+        <w:trPr>
+          <w:cantSplit/>
+        </w:trPr>
+        <w:tc>
+          <w:tcPr>
+            <w:tcW w:type="dxa" w:w="680"/>
+          </w:tcPr>
+          <w:p>
+            <w:pPr>
+              <w:spacing w:after="20" w:before="20" w:line="240" w:lineRule="auto"/>
+            </w:pPr>
+            <w:r/>
+            <w:r>
+              <w:rPr>
+                <w:sz w:val="17"/>
+              </w:rPr>
+              <w:t>E06</w:t>
+            </w:r>
+          </w:p>
+        </w:tc>
+        <w:tc>
+          <w:tcPr>
+            <w:tcW w:type="dxa" w:w="2721"/>
+          </w:tcPr>
+          <w:p>
+            <w:pPr>
+              <w:spacing w:after="20" w:before="20" w:line="240" w:lineRule="auto"/>
+            </w:pPr>
+            <w:r/>
+            <w:r>
+              <w:rPr>
+                <w:sz w:val="17"/>
+              </w:rPr>
+              <w:t>PC-USER usa DNS y HTTP</w:t>
+            </w:r>
+          </w:p>
+        </w:tc>
+        <w:tc>
+          <w:tcPr>
+            <w:tcW w:type="dxa" w:w="2721"/>
+          </w:tcPr>
+          <w:p>
+            <w:pPr>
+              <w:spacing w:after="20" w:before="20" w:line="240" w:lineRule="auto"/>
+            </w:pPr>
+            <w:r/>
+            <w:r>
+              <w:rPr>
+                <w:sz w:val="17"/>
+              </w:rPr>
+              <w:t>Vista interna</w:t>
+            </w:r>
+          </w:p>
+        </w:tc>
+        <w:tc>
+          <w:tcPr>
+            <w:tcW w:type="dxa" w:w="3402"/>
+          </w:tcPr>
+          <w:p>
+            <w:pPr>
+              <w:spacing w:after="20" w:before="20" w:line="240" w:lineRule="auto"/>
+            </w:pPr>
+            <w:r/>
+            <w:r>
+              <w:rPr>
+                <w:sz w:val="17"/>
+              </w:rPr>
+              <w:t>10.50.1.34; HTTP 200; política 1</w:t>
+            </w:r>
+          </w:p>
+        </w:tc>
+      </w:tr>
+      <w:tr>
+        <w:trPr>
+          <w:cantSplit/>
+        </w:trPr>
+        <w:tc>
+          <w:tcPr>
+            <w:tcW w:type="dxa" w:w="680"/>
+          </w:tcPr>
+          <w:p>
+            <w:pPr>
+              <w:spacing w:after="20" w:before="20" w:line="240" w:lineRule="auto"/>
+            </w:pPr>
+            <w:r/>
+            <w:r>
+              <w:rPr>
+                <w:sz w:val="17"/>
+              </w:rPr>
+              <w:t>E07</w:t>
+            </w:r>
+          </w:p>
+        </w:tc>
+        <w:tc>
+          <w:tcPr>
+            <w:tcW w:type="dxa" w:w="2721"/>
+          </w:tcPr>
+          <w:p>
+            <w:pPr>
+              <w:spacing w:after="20" w:before="20" w:line="240" w:lineRule="auto"/>
+            </w:pPr>
+            <w:r/>
+            <w:r>
+              <w:rPr>
+                <w:sz w:val="17"/>
+              </w:rPr>
+              <w:t>PC-USER hacia PC-ADMIN</w:t>
+            </w:r>
+          </w:p>
+        </w:tc>
+        <w:tc>
+          <w:tcPr>
+            <w:tcW w:type="dxa" w:w="2721"/>
+          </w:tcPr>
+          <w:p>
+            <w:pPr>
+              <w:spacing w:after="20" w:before="20" w:line="240" w:lineRule="auto"/>
+            </w:pPr>
+            <w:r/>
+            <w:r>
+              <w:rPr>
+                <w:sz w:val="17"/>
+              </w:rPr>
+              <w:t>ACL-SEG-USUARIOS, línea 30</w:t>
+            </w:r>
+          </w:p>
+        </w:tc>
+        <w:tc>
+          <w:tcPr>
+            <w:tcW w:type="dxa" w:w="3402"/>
+          </w:tcPr>
+          <w:p>
+            <w:pPr>
+              <w:spacing w:after="20" w:before="20" w:line="240" w:lineRule="auto"/>
+            </w:pPr>
+            <w:r/>
+            <w:r>
+              <w:rPr>
+                <w:sz w:val="17"/>
+              </w:rPr>
+              <w:t>Packet filtered desde 10.50.0.1</w:t>
+            </w:r>
+          </w:p>
+        </w:tc>
+      </w:tr>
+      <w:tr>
+        <w:trPr>
+          <w:cantSplit/>
+        </w:trPr>
+        <w:tc>
+          <w:tcPr>
+            <w:tcW w:type="dxa" w:w="680"/>
+          </w:tcPr>
+          <w:p>
+            <w:pPr>
+              <w:spacing w:after="20" w:before="20" w:line="240" w:lineRule="auto"/>
+            </w:pPr>
+            <w:r/>
+            <w:r>
+              <w:rPr>
+                <w:sz w:val="17"/>
+              </w:rPr>
+              <w:t>E08</w:t>
+            </w:r>
+          </w:p>
+        </w:tc>
+        <w:tc>
+          <w:tcPr>
+            <w:tcW w:type="dxa" w:w="2721"/>
+          </w:tcPr>
+          <w:p>
+            <w:pPr>
+              <w:spacing w:after="20" w:before="20" w:line="240" w:lineRule="auto"/>
+            </w:pPr>
+            <w:r/>
+            <w:r>
+              <w:rPr>
+                <w:sz w:val="17"/>
+              </w:rPr>
+              <w:t>PC-ADMIN hacia PC-USER</w:t>
+            </w:r>
+          </w:p>
+        </w:tc>
+        <w:tc>
+          <w:tcPr>
+            <w:tcW w:type="dxa" w:w="2721"/>
+          </w:tcPr>
+          <w:p>
+            <w:pPr>
+              <w:spacing w:after="20" w:before="20" w:line="240" w:lineRule="auto"/>
+            </w:pPr>
+            <w:r/>
+            <w:r>
+              <w:rPr>
+                <w:sz w:val="17"/>
+              </w:rPr>
+              <w:t>Responde por la línea 10</w:t>
+            </w:r>
+          </w:p>
+        </w:tc>
+        <w:tc>
+          <w:tcPr>
+            <w:tcW w:type="dxa" w:w="3402"/>
+          </w:tcPr>
+          <w:p>
+            <w:pPr>
+              <w:spacing w:after="20" w:before="20" w:line="240" w:lineRule="auto"/>
+            </w:pPr>
+            <w:r/>
+            <w:r>
+              <w:rPr>
+                <w:sz w:val="17"/>
+              </w:rPr>
+              <w:t>Responde, ttl 63</w:t>
+            </w:r>
+          </w:p>
+        </w:tc>
+      </w:tr>
+      <w:tr>
+        <w:trPr>
+          <w:cantSplit/>
+        </w:trPr>
+        <w:tc>
+          <w:tcPr>
+            <w:tcW w:type="dxa" w:w="680"/>
+          </w:tcPr>
+          <w:p>
+            <w:pPr>
+              <w:spacing w:after="20" w:before="20" w:line="240" w:lineRule="auto"/>
+            </w:pPr>
+            <w:r/>
+            <w:r>
+              <w:rPr>
+                <w:sz w:val="17"/>
+              </w:rPr>
+              <w:t>E09</w:t>
+            </w:r>
+          </w:p>
+        </w:tc>
+        <w:tc>
+          <w:tcPr>
+            <w:tcW w:type="dxa" w:w="2721"/>
+          </w:tcPr>
+          <w:p>
+            <w:pPr>
+              <w:spacing w:after="20" w:before="20" w:line="240" w:lineRule="auto"/>
+            </w:pPr>
+            <w:r/>
+            <w:r>
+              <w:rPr>
+                <w:sz w:val="17"/>
+              </w:rPr>
+              <w:t>SRV-DMZ hacia PC-USER</w:t>
+            </w:r>
+          </w:p>
+        </w:tc>
+        <w:tc>
+          <w:tcPr>
+            <w:tcW w:type="dxa" w:w="2721"/>
+          </w:tcPr>
+          <w:p>
+            <w:pPr>
+              <w:spacing w:after="20" w:before="20" w:line="240" w:lineRule="auto"/>
+            </w:pPr>
+            <w:r/>
+            <w:r>
+              <w:rPr>
+                <w:sz w:val="17"/>
+              </w:rPr>
+              <w:t>Bloqueado</w:t>
+            </w:r>
+          </w:p>
+        </w:tc>
+        <w:tc>
+          <w:tcPr>
+            <w:tcW w:type="dxa" w:w="3402"/>
+          </w:tcPr>
+          <w:p>
+            <w:pPr>
+              <w:spacing w:after="20" w:before="20" w:line="240" w:lineRule="auto"/>
+            </w:pPr>
+            <w:r/>
+            <w:r>
+              <w:rPr>
+                <w:sz w:val="17"/>
+              </w:rPr>
+              <w:t>100% de pérdida; política 3</w:t>
+            </w:r>
+          </w:p>
+        </w:tc>
+      </w:tr>
+      <w:tr>
+        <w:trPr>
+          <w:cantSplit/>
+        </w:trPr>
+        <w:tc>
+          <w:tcPr>
+            <w:tcW w:type="dxa" w:w="680"/>
+          </w:tcPr>
+          <w:p>
+            <w:pPr>
+              <w:spacing w:after="20" w:before="20" w:line="240" w:lineRule="auto"/>
+            </w:pPr>
+            <w:r/>
+            <w:r>
+              <w:rPr>
+                <w:sz w:val="17"/>
+              </w:rPr>
+              <w:t>E10</w:t>
+            </w:r>
+          </w:p>
+        </w:tc>
+        <w:tc>
+          <w:tcPr>
+            <w:tcW w:type="dxa" w:w="2721"/>
+          </w:tcPr>
+          <w:p>
+            <w:pPr>
+              <w:spacing w:after="20" w:before="20" w:line="240" w:lineRule="auto"/>
+            </w:pPr>
+            <w:r/>
+            <w:r>
+              <w:rPr>
+                <w:sz w:val="17"/>
+              </w:rPr>
+              <w:t>Origen falsificado en el borde</w:t>
+            </w:r>
+          </w:p>
+        </w:tc>
+        <w:tc>
+          <w:tcPr>
+            <w:tcW w:type="dxa" w:w="2721"/>
+          </w:tcPr>
+          <w:p>
+            <w:pPr>
+              <w:spacing w:after="20" w:before="20" w:line="240" w:lineRule="auto"/>
+            </w:pPr>
+            <w:r/>
+            <w:r>
+              <w:rPr>
+                <w:sz w:val="17"/>
+              </w:rPr>
+              <w:t>ACL-BORDE-IN, línea 10</w:t>
+            </w:r>
+          </w:p>
+        </w:tc>
+        <w:tc>
+          <w:tcPr>
+            <w:tcW w:type="dxa" w:w="3402"/>
+          </w:tcPr>
+          <w:p>
+            <w:pPr>
+              <w:spacing w:after="20" w:before="20" w:line="240" w:lineRule="auto"/>
+            </w:pPr>
+            <w:r/>
+            <w:r>
+              <w:rPr>
+                <w:sz w:val="17"/>
+              </w:rPr>
+              <w:t>0 de 3 respuestas; contador en 3</w:t>
+            </w:r>
+          </w:p>
+        </w:tc>
+      </w:tr>
+      <w:tr>
+        <w:trPr>
+          <w:cantSplit/>
+        </w:trPr>
+        <w:tc>
+          <w:tcPr>
+            <w:tcW w:type="dxa" w:w="680"/>
+          </w:tcPr>
+          <w:p>
+            <w:pPr>
+              <w:spacing w:after="20" w:before="20" w:line="240" w:lineRule="auto"/>
+            </w:pPr>
+            <w:r/>
+            <w:r>
+              <w:rPr>
+                <w:sz w:val="17"/>
+              </w:rPr>
+              <w:t>E11</w:t>
+            </w:r>
+          </w:p>
+        </w:tc>
+        <w:tc>
+          <w:tcPr>
+            <w:tcW w:type="dxa" w:w="2721"/>
+          </w:tcPr>
+          <w:p>
+            <w:pPr>
+              <w:spacing w:after="20" w:before="20" w:line="240" w:lineRule="auto"/>
+            </w:pPr>
+            <w:r/>
+            <w:r>
+              <w:rPr>
+                <w:sz w:val="17"/>
+              </w:rPr>
+              <w:t>HTTPS al FortiGate por port1</w:t>
+            </w:r>
+          </w:p>
+        </w:tc>
+        <w:tc>
+          <w:tcPr>
+            <w:tcW w:type="dxa" w:w="2721"/>
+          </w:tcPr>
+          <w:p>
+            <w:pPr>
+              <w:spacing w:after="20" w:before="20" w:line="240" w:lineRule="auto"/>
+            </w:pPr>
+            <w:r/>
+            <w:r>
+              <w:rPr>
+                <w:sz w:val="17"/>
+              </w:rPr>
+              <w:t>Rechazado</w:t>
+            </w:r>
+          </w:p>
+        </w:tc>
+        <w:tc>
+          <w:tcPr>
+            <w:tcW w:type="dxa" w:w="3402"/>
+          </w:tcPr>
+          <w:p>
+            <w:pPr>
+              <w:spacing w:after="20" w:before="20" w:line="240" w:lineRule="auto"/>
+            </w:pPr>
+            <w:r/>
+            <w:r>
+              <w:rPr>
+                <w:sz w:val="17"/>
+              </w:rPr>
+              <w:t>https=000</w:t>
+            </w:r>
+          </w:p>
+        </w:tc>
+      </w:tr>
+      <w:tr>
+        <w:trPr>
+          <w:cantSplit/>
+        </w:trPr>
+        <w:tc>
+          <w:tcPr>
+            <w:tcW w:type="dxa" w:w="680"/>
+          </w:tcPr>
+          <w:p>
+            <w:pPr>
+              <w:spacing w:after="20" w:before="20" w:line="240" w:lineRule="auto"/>
+            </w:pPr>
+            <w:r/>
+            <w:r>
+              <w:rPr>
+                <w:sz w:val="17"/>
+              </w:rPr>
+              <w:t>E12</w:t>
+            </w:r>
+          </w:p>
+        </w:tc>
+        <w:tc>
+          <w:tcPr>
+            <w:tcW w:type="dxa" w:w="2721"/>
+          </w:tcPr>
+          <w:p>
+            <w:pPr>
+              <w:spacing w:after="20" w:before="20" w:line="240" w:lineRule="auto"/>
+            </w:pPr>
+            <w:r/>
+            <w:r>
+              <w:rPr>
+                <w:sz w:val="17"/>
+              </w:rPr>
+              <w:t>SSH a R-LAN</w:t>
+            </w:r>
+          </w:p>
+        </w:tc>
+        <w:tc>
+          <w:tcPr>
+            <w:tcW w:type="dxa" w:w="2721"/>
+          </w:tcPr>
+          <w:p>
+            <w:pPr>
+              <w:spacing w:after="20" w:before="20" w:line="240" w:lineRule="auto"/>
+            </w:pPr>
+            <w:r/>
+            <w:r>
+              <w:rPr>
+                <w:sz w:val="17"/>
+              </w:rPr>
+              <w:t>Bloqueado a PC-USER; abierto a PC-ADMIN</w:t>
+            </w:r>
+          </w:p>
+        </w:tc>
+        <w:tc>
+          <w:tcPr>
+            <w:tcW w:type="dxa" w:w="3402"/>
+          </w:tcPr>
+          <w:p>
+            <w:pPr>
+              <w:spacing w:after="20" w:before="20" w:line="240" w:lineRule="auto"/>
+            </w:pPr>
+            <w:r/>
+            <w:r>
+              <w:rPr>
+                <w:sz w:val="17"/>
+              </w:rPr>
+              <w:t>Bloqueado y abierto, respectivamente</w:t>
+            </w:r>
+          </w:p>
+        </w:tc>
+      </w:tr>
+      <w:tr>
+        <w:trPr>
+          <w:cantSplit/>
+        </w:trPr>
+        <w:tc>
+          <w:tcPr>
+            <w:tcW w:type="dxa" w:w="680"/>
+          </w:tcPr>
+          <w:p>
+            <w:pPr>
+              <w:spacing w:after="20" w:before="20" w:line="240" w:lineRule="auto"/>
+            </w:pPr>
+            <w:r/>
+            <w:r>
+              <w:rPr>
+                <w:sz w:val="17"/>
+              </w:rPr>
+              <w:t>E13</w:t>
+            </w:r>
+          </w:p>
+        </w:tc>
+        <w:tc>
+          <w:tcPr>
+            <w:tcW w:type="dxa" w:w="2721"/>
+          </w:tcPr>
+          <w:p>
+            <w:pPr>
+              <w:spacing w:after="20" w:before="20" w:line="240" w:lineRule="auto"/>
+            </w:pPr>
+            <w:r/>
+            <w:r>
+              <w:rPr>
+                <w:sz w:val="17"/>
+              </w:rPr>
+              <w:t>GUI del FortiGate</w:t>
+            </w:r>
+          </w:p>
+        </w:tc>
+        <w:tc>
+          <w:tcPr>
+            <w:tcW w:type="dxa" w:w="2721"/>
+          </w:tcPr>
+          <w:p>
+            <w:pPr>
+              <w:spacing w:after="20" w:before="20" w:line="240" w:lineRule="auto"/>
+            </w:pPr>
+            <w:r/>
+            <w:r>
+              <w:rPr>
+                <w:sz w:val="17"/>
+              </w:rPr>
+              <w:t>Solo PC-ADMIN</w:t>
+            </w:r>
+          </w:p>
+        </w:tc>
+        <w:tc>
+          <w:tcPr>
+            <w:tcW w:type="dxa" w:w="3402"/>
+          </w:tcPr>
+          <w:p>
+            <w:pPr>
+              <w:spacing w:after="20" w:before="20" w:line="240" w:lineRule="auto"/>
+            </w:pPr>
+            <w:r/>
+            <w:r>
+              <w:rPr>
+                <w:sz w:val="17"/>
+              </w:rPr>
+              <w:t>gui=000 en PC-USER; gui=200 en PC-ADMIN</w:t>
+            </w:r>
+          </w:p>
+        </w:tc>
+      </w:tr>
+      <w:tr>
+        <w:trPr>
+          <w:cantSplit/>
+        </w:trPr>
+        <w:tc>
+          <w:tcPr>
+            <w:tcW w:type="dxa" w:w="680"/>
+          </w:tcPr>
+          <w:p>
+            <w:pPr>
+              <w:spacing w:after="20" w:before="20" w:line="240" w:lineRule="auto"/>
+            </w:pPr>
+            <w:r/>
+            <w:r>
+              <w:rPr>
+                <w:sz w:val="17"/>
+              </w:rPr>
+              <w:t>E14</w:t>
+            </w:r>
+          </w:p>
+        </w:tc>
+        <w:tc>
+          <w:tcPr>
+            <w:tcW w:type="dxa" w:w="2721"/>
+          </w:tcPr>
+          <w:p>
+            <w:pPr>
+              <w:spacing w:after="20" w:before="20" w:line="240" w:lineRule="auto"/>
+            </w:pPr>
+            <w:r/>
+            <w:r>
+              <w:rPr>
+                <w:sz w:val="17"/>
+              </w:rPr>
+              <w:t>SRV-DMZ hacia Internet</w:t>
+            </w:r>
+          </w:p>
+        </w:tc>
+        <w:tc>
+          <w:tcPr>
+            <w:tcW w:type="dxa" w:w="2721"/>
+          </w:tcPr>
+          <w:p>
+            <w:pPr>
+              <w:spacing w:after="20" w:before="20" w:line="240" w:lineRule="auto"/>
+            </w:pPr>
+            <w:r/>
+            <w:r>
+              <w:rPr>
+                <w:sz w:val="17"/>
+              </w:rPr>
+              <w:t>Denegación implícita</w:t>
+            </w:r>
+          </w:p>
+        </w:tc>
+        <w:tc>
+          <w:tcPr>
+            <w:tcW w:type="dxa" w:w="3402"/>
+          </w:tcPr>
+          <w:p>
+            <w:pPr>
+              <w:spacing w:after="20" w:before="20" w:line="240" w:lineRule="auto"/>
+            </w:pPr>
+            <w:r/>
+            <w:r>
+              <w:rPr>
+                <w:sz w:val="17"/>
+              </w:rPr>
+              <w:t>100% de pérdida</w:t>
+            </w:r>
+          </w:p>
+        </w:tc>
+      </w:tr>
+      <w:tr>
+        <w:trPr>
+          <w:cantSplit/>
+        </w:trPr>
+        <w:tc>
+          <w:tcPr>
+            <w:tcW w:type="dxa" w:w="680"/>
+          </w:tcPr>
+          <w:p>
+            <w:pPr>
+              <w:spacing w:after="20" w:before="20" w:line="240" w:lineRule="auto"/>
+            </w:pPr>
+            <w:r/>
+            <w:r>
+              <w:rPr>
+                <w:sz w:val="17"/>
+              </w:rPr>
+              <w:t>E15</w:t>
+            </w:r>
+          </w:p>
+        </w:tc>
+        <w:tc>
+          <w:tcPr>
+            <w:tcW w:type="dxa" w:w="2721"/>
+          </w:tcPr>
+          <w:p>
+            <w:pPr>
+              <w:spacing w:after="20" w:before="20" w:line="240" w:lineRule="auto"/>
+            </w:pPr>
+            <w:r/>
+            <w:r>
+              <w:rPr>
+                <w:sz w:val="17"/>
+              </w:rPr>
+              <w:t>Destino interno inexistente</w:t>
+            </w:r>
+          </w:p>
+        </w:tc>
+        <w:tc>
+          <w:tcPr>
+            <w:tcW w:type="dxa" w:w="2721"/>
+          </w:tcPr>
+          <w:p>
+            <w:pPr>
+              <w:spacing w:after="20" w:before="20" w:line="240" w:lineRule="auto"/>
+            </w:pPr>
+            <w:r/>
+            <w:r>
+              <w:rPr>
+                <w:sz w:val="17"/>
+              </w:rPr>
+              <w:t>Descartado por blackhole</w:t>
+            </w:r>
+          </w:p>
+        </w:tc>
+        <w:tc>
+          <w:tcPr>
+            <w:tcW w:type="dxa" w:w="3402"/>
+          </w:tcPr>
+          <w:p>
+            <w:pPr>
+              <w:spacing w:after="20" w:before="20" w:line="240" w:lineRule="auto"/>
+            </w:pPr>
+            <w:r/>
+            <w:r>
+              <w:rPr>
+                <w:sz w:val="17"/>
+              </w:rPr>
+              <w:t>Descartado sin salir a Internet</w:t>
+            </w:r>
+          </w:p>
+        </w:tc>
+      </w:tr>
+      <w:tr>
+        <w:trPr>
+          <w:cantSplit/>
+        </w:trPr>
+        <w:tc>
+          <w:tcPr>
+            <w:tcW w:type="dxa" w:w="680"/>
+          </w:tcPr>
+          <w:p>
+            <w:pPr>
+              <w:spacing w:after="20" w:before="20" w:line="240" w:lineRule="auto"/>
+            </w:pPr>
+            <w:r/>
+            <w:r>
+              <w:rPr>
+                <w:sz w:val="17"/>
+              </w:rPr>
+              <w:t>E16</w:t>
+            </w:r>
+          </w:p>
+        </w:tc>
+        <w:tc>
+          <w:tcPr>
+            <w:tcW w:type="dxa" w:w="2721"/>
+          </w:tcPr>
+          <w:p>
+            <w:pPr>
+              <w:spacing w:after="20" w:before="20" w:line="240" w:lineRule="auto"/>
+            </w:pPr>
+            <w:r/>
+            <w:r>
+              <w:rPr>
+                <w:sz w:val="17"/>
+              </w:rPr>
+              <w:t>Logs fuera del equipo</w:t>
+            </w:r>
+          </w:p>
+        </w:tc>
+        <w:tc>
+          <w:tcPr>
+            <w:tcW w:type="dxa" w:w="2721"/>
+          </w:tcPr>
+          <w:p>
+            <w:pPr>
+              <w:spacing w:after="20" w:before="20" w:line="240" w:lineRule="auto"/>
+            </w:pPr>
+            <w:r/>
+            <w:r>
+              <w:rPr>
+                <w:sz w:val="17"/>
+              </w:rPr>
+              <w:t>Syslog en PC-ADMIN</w:t>
+            </w:r>
+          </w:p>
+        </w:tc>
+        <w:tc>
+          <w:tcPr>
+            <w:tcW w:type="dxa" w:w="3402"/>
+          </w:tcPr>
+          <w:p>
+            <w:pPr>
+              <w:spacing w:after="20" w:before="20" w:line="240" w:lineRule="auto"/>
+            </w:pPr>
+            <w:r/>
+            <w:r>
+              <w:rPr>
+                <w:sz w:val="17"/>
+              </w:rPr>
+              <w:t>Recibió las denegaciones de E01, E07 y E12</w:t>
+            </w:r>
+          </w:p>
+        </w:tc>
+      </w:tr>
+      <w:tr>
+        <w:trPr>
+          <w:cantSplit/>
+        </w:trPr>
+        <w:tc>
+          <w:tcPr>
+            <w:tcW w:type="dxa" w:w="680"/>
+          </w:tcPr>
+          <w:p>
+            <w:pPr>
+              <w:spacing w:after="20" w:before="20" w:line="240" w:lineRule="auto"/>
+            </w:pPr>
+            <w:r/>
+            <w:r>
+              <w:rPr>
+                <w:sz w:val="17"/>
+              </w:rPr>
+              <w:t>R01</w:t>
+            </w:r>
+          </w:p>
+        </w:tc>
+        <w:tc>
+          <w:tcPr>
+            <w:tcW w:type="dxa" w:w="2721"/>
+          </w:tcPr>
+          <w:p>
+            <w:pPr>
+              <w:spacing w:after="20" w:before="20" w:line="240" w:lineRule="auto"/>
+            </w:pPr>
+            <w:r/>
+            <w:r>
+              <w:rPr>
+                <w:sz w:val="17"/>
+              </w:rPr>
+              <w:t>Vecinos OSPFv2 y OSPFv3</w:t>
+            </w:r>
+          </w:p>
+        </w:tc>
+        <w:tc>
+          <w:tcPr>
+            <w:tcW w:type="dxa" w:w="2721"/>
+          </w:tcPr>
+          <w:p>
+            <w:pPr>
+              <w:spacing w:after="20" w:before="20" w:line="240" w:lineRule="auto"/>
+            </w:pPr>
+            <w:r/>
+            <w:r>
+              <w:rPr>
+                <w:sz w:val="17"/>
+              </w:rPr>
+              <w:t>Full en ambos</w:t>
+            </w:r>
+          </w:p>
+        </w:tc>
+        <w:tc>
+          <w:tcPr>
+            <w:tcW w:type="dxa" w:w="3402"/>
+          </w:tcPr>
+          <w:p>
+            <w:pPr>
+              <w:spacing w:after="20" w:before="20" w:line="240" w:lineRule="auto"/>
+            </w:pPr>
+            <w:r/>
+            <w:r>
+              <w:rPr>
+                <w:sz w:val="17"/>
+              </w:rPr>
+              <w:t>Full/Backup en port2</w:t>
+            </w:r>
+          </w:p>
+        </w:tc>
+      </w:tr>
+      <w:tr>
+        <w:trPr>
+          <w:cantSplit/>
+        </w:trPr>
+        <w:tc>
+          <w:tcPr>
+            <w:tcW w:type="dxa" w:w="680"/>
+          </w:tcPr>
+          <w:p>
+            <w:pPr>
+              <w:spacing w:after="20" w:before="20" w:line="240" w:lineRule="auto"/>
+            </w:pPr>
+            <w:r/>
+            <w:r>
+              <w:rPr>
+                <w:sz w:val="17"/>
+              </w:rPr>
+              <w:t>R02</w:t>
+            </w:r>
+          </w:p>
+        </w:tc>
+        <w:tc>
+          <w:tcPr>
+            <w:tcW w:type="dxa" w:w="2721"/>
+          </w:tcPr>
+          <w:p>
+            <w:pPr>
+              <w:spacing w:after="20" w:before="20" w:line="240" w:lineRule="auto"/>
+            </w:pPr>
+            <w:r/>
+            <w:r>
+              <w:rPr>
+                <w:sz w:val="17"/>
+              </w:rPr>
+              <w:t>Tablas de rutas</w:t>
+            </w:r>
+          </w:p>
+        </w:tc>
+        <w:tc>
+          <w:tcPr>
+            <w:tcW w:type="dxa" w:w="2721"/>
+          </w:tcPr>
+          <w:p>
+            <w:pPr>
+              <w:spacing w:after="20" w:before="20" w:line="240" w:lineRule="auto"/>
+            </w:pPr>
+            <w:r/>
+            <w:r>
+              <w:rPr>
+                <w:sz w:val="17"/>
+              </w:rPr>
+              <w:t>Coinciden con el diseño</w:t>
+            </w:r>
+          </w:p>
+        </w:tc>
+        <w:tc>
+          <w:tcPr>
+            <w:tcW w:type="dxa" w:w="3402"/>
+          </w:tcPr>
+          <w:p>
+            <w:pPr>
+              <w:spacing w:after="20" w:before="20" w:line="240" w:lineRule="auto"/>
+            </w:pPr>
+            <w:r/>
+            <w:r>
+              <w:rPr>
+                <w:sz w:val="17"/>
+              </w:rPr>
+              <w:t>No faltó ninguna ruta</w:t>
+            </w:r>
+          </w:p>
+        </w:tc>
+      </w:tr>
+      <w:tr>
+        <w:trPr>
+          <w:cantSplit/>
+        </w:trPr>
+        <w:tc>
+          <w:tcPr>
+            <w:tcW w:type="dxa" w:w="680"/>
+          </w:tcPr>
+          <w:p>
+            <w:pPr>
+              <w:spacing w:after="20" w:before="20" w:line="240" w:lineRule="auto"/>
+            </w:pPr>
+            <w:r/>
+            <w:r>
+              <w:rPr>
+                <w:sz w:val="17"/>
+              </w:rPr>
+              <w:t>F01</w:t>
+            </w:r>
+          </w:p>
+        </w:tc>
+        <w:tc>
+          <w:tcPr>
+            <w:tcW w:type="dxa" w:w="2721"/>
+          </w:tcPr>
+          <w:p>
+            <w:pPr>
+              <w:spacing w:after="20" w:before="20" w:line="240" w:lineRule="auto"/>
+            </w:pPr>
+            <w:r/>
+            <w:r>
+              <w:rPr>
+                <w:sz w:val="17"/>
+              </w:rPr>
+              <w:t>Desactivar la política 1</w:t>
+            </w:r>
+          </w:p>
+        </w:tc>
+        <w:tc>
+          <w:tcPr>
+            <w:tcW w:type="dxa" w:w="2721"/>
+          </w:tcPr>
+          <w:p>
+            <w:pPr>
+              <w:spacing w:after="20" w:before="20" w:line="240" w:lineRule="auto"/>
+            </w:pPr>
+            <w:r/>
+            <w:r>
+              <w:rPr>
+                <w:sz w:val="17"/>
+              </w:rPr>
+              <w:t>La publicación cae y vuelve</w:t>
+            </w:r>
+          </w:p>
+        </w:tc>
+        <w:tc>
+          <w:tcPr>
+            <w:tcW w:type="dxa" w:w="3402"/>
+          </w:tcPr>
+          <w:p>
+            <w:pPr>
+              <w:spacing w:after="20" w:before="20" w:line="240" w:lineRule="auto"/>
+            </w:pPr>
+            <w:r/>
+            <w:r>
+              <w:rPr>
+                <w:sz w:val="17"/>
+              </w:rPr>
+              <w:t>http4=000 y luego http4=200</w:t>
+            </w:r>
+          </w:p>
+        </w:tc>
+      </w:tr>
+      <w:tr>
+        <w:trPr>
+          <w:cantSplit/>
+        </w:trPr>
+        <w:tc>
+          <w:tcPr>
+            <w:tcW w:type="dxa" w:w="680"/>
+          </w:tcPr>
+          <w:p>
+            <w:pPr>
+              <w:spacing w:after="20" w:before="20" w:line="240" w:lineRule="auto"/>
+            </w:pPr>
+            <w:r/>
+            <w:r>
+              <w:rPr>
+                <w:sz w:val="17"/>
+              </w:rPr>
+              <w:t>F02</w:t>
+            </w:r>
+          </w:p>
+        </w:tc>
+        <w:tc>
+          <w:tcPr>
+            <w:tcW w:type="dxa" w:w="2721"/>
+          </w:tcPr>
+          <w:p>
+            <w:pPr>
+              <w:spacing w:after="20" w:before="20" w:line="240" w:lineRule="auto"/>
+            </w:pPr>
+            <w:r/>
+            <w:r>
+              <w:rPr>
+                <w:sz w:val="17"/>
+              </w:rPr>
+              <w:t>Apagar la interfaz de R-LAN hacia el FortiGate</w:t>
+            </w:r>
+          </w:p>
+        </w:tc>
+        <w:tc>
+          <w:tcPr>
+            <w:tcW w:type="dxa" w:w="2721"/>
+          </w:tcPr>
+          <w:p>
+            <w:pPr>
+              <w:spacing w:after="20" w:before="20" w:line="240" w:lineRule="auto"/>
+            </w:pPr>
+            <w:r/>
+            <w:r>
+              <w:rPr>
+                <w:sz w:val="17"/>
+              </w:rPr>
+              <w:t>La LAN pierde servicio; el externo sigue</w:t>
+            </w:r>
+          </w:p>
+        </w:tc>
+        <w:tc>
+          <w:tcPr>
+            <w:tcW w:type="dxa" w:w="3402"/>
+          </w:tcPr>
+          <w:p>
+            <w:pPr>
+              <w:spacing w:after="20" w:before="20" w:line="240" w:lineRule="auto"/>
+            </w:pPr>
+            <w:r/>
+            <w:r>
+              <w:rPr>
+                <w:sz w:val="17"/>
+              </w:rPr>
+              <w:t>http4=000 en la LAN; http4=200 desde afuera</w:t>
+            </w:r>
+          </w:p>
+        </w:tc>
+      </w:tr>
+    </w:tbl>
+    <w:p>
+      <w:pPr>
+        <w:spacing w:after="40"/>
+      </w:pPr>
+    </w:p>
+    <w:p>
+      <w:pPr>
+        <w:pStyle w:val="Heading1"/>
+      </w:pPr>
+      <w:r>
+        <w:t>Anexo G. Salidas del FortiGate</w:t>
+      </w:r>
+    </w:p>
+    <w:p>
+      <w:pPr>
+        <w:pStyle w:val="Heading2"/>
+      </w:pPr>
+      <w:r>
+        <w:t>G.1 Tabla de rutas de FGT-01</w:t>
+      </w:r>
+    </w:p>
+    <w:p>
+      <w:pPr>
+        <w:pStyle w:val="Codigo"/>
+      </w:pPr>
+      <w:r>
+        <w:t>FGT-01 # get router info routing-table all</w:t>
+      </w:r>
+    </w:p>
+    <w:p>
+      <w:pPr>
+        <w:pStyle w:val="Codigo"/>
+      </w:pPr>
+      <w:r>
+        <w:t>S*      0.0.0.0/0 [10/0] via 203.0.113.17, port1</w:t>
+      </w:r>
+    </w:p>
+    <w:p>
+      <w:pPr>
+        <w:pStyle w:val="Codigo"/>
+      </w:pPr>
+      <w:r>
+        <w:t>S       10.50.0.0/16 [254/0] is a summary, Null</w:t>
+      </w:r>
+    </w:p>
+    <w:p>
+      <w:pPr>
+        <w:pStyle w:val="Codigo"/>
+      </w:pPr>
+      <w:r>
+        <w:t>O       10.50.0.0/24 [110/2] via 10.50.1.50, port2</w:t>
+      </w:r>
+    </w:p>
+    <w:p>
+      <w:pPr>
+        <w:pStyle w:val="Codigo"/>
+      </w:pPr>
+      <w:r>
+        <w:t>O       10.50.1.0/27 [110/2] via 10.50.1.50, port2</w:t>
+      </w:r>
+    </w:p>
+    <w:p>
+      <w:pPr>
+        <w:pStyle w:val="Codigo"/>
+      </w:pPr>
+      <w:r>
+        <w:t>C       10.50.1.32/28 is directly connected, port3</w:t>
+      </w:r>
+    </w:p>
+    <w:p>
+      <w:pPr>
+        <w:pStyle w:val="Codigo"/>
+      </w:pPr>
+      <w:r>
+        <w:t>C       10.50.1.48/30 is directly connected, port2</w:t>
+      </w:r>
+    </w:p>
+    <w:p>
+      <w:pPr>
+        <w:pStyle w:val="Codigo"/>
+      </w:pPr>
+      <w:r>
+        <w:t>C       203.0.113.16/29 is directly connected, port1</w:t>
+      </w:r>
+    </w:p>
+    <w:p>
+      <w:pPr>
+        <w:pStyle w:val="Codigo"/>
+      </w:pPr>
+      <w:r>
+        <w:t xml:space="preserve"> </w:t>
+      </w:r>
+    </w:p>
+    <w:p>
+      <w:pPr>
+        <w:pStyle w:val="Codigo"/>
+      </w:pPr>
+      <w:r>
+        <w:t>FGT-01 # get router info6 routing-table</w:t>
+      </w:r>
+    </w:p>
+    <w:p>
+      <w:pPr>
+        <w:pStyle w:val="Codigo"/>
+      </w:pPr>
+      <w:r>
+        <w:t>S*      ::/0 [10/0] via 2001:db8:105:ff01::1, port1</w:t>
+      </w:r>
+    </w:p>
+    <w:p>
+      <w:pPr>
+        <w:pStyle w:val="Codigo"/>
+      </w:pPr>
+      <w:r>
+        <w:t>S       2001:db8:105::/48 [254/0] via ::, Null</w:t>
+      </w:r>
+    </w:p>
+    <w:p>
+      <w:pPr>
+        <w:pStyle w:val="Codigo"/>
+      </w:pPr>
+      <w:r>
+        <w:t>O       2001:db8:105:10::/64 [110/2] via fe80::2, port2</w:t>
+      </w:r>
+    </w:p>
+    <w:p>
+      <w:pPr>
+        <w:pStyle w:val="Codigo"/>
+      </w:pPr>
+      <w:r>
+        <w:t>O       2001:db8:105:20::/64 [110/2] via fe80::2, port2</w:t>
+      </w:r>
+    </w:p>
+    <w:p>
+      <w:pPr>
+        <w:pStyle w:val="Codigo"/>
+      </w:pPr>
+      <w:r>
+        <w:t>C       2001:db8:105:30::/64 via ::, port3</w:t>
+      </w:r>
+    </w:p>
+    <w:p>
+      <w:pPr>
+        <w:pStyle w:val="Codigo"/>
+      </w:pPr>
+      <w:r>
+        <w:t>C       2001:db8:105:ff00::/64 via ::, port2</w:t>
+      </w:r>
+    </w:p>
+    <w:p>
+      <w:pPr>
+        <w:pStyle w:val="Codigo"/>
+      </w:pPr>
+      <w:r>
+        <w:t>C       2001:db8:105:ff01::/64 via ::, port1</w:t>
+      </w:r>
+    </w:p>
+    <w:p>
+      <w:pPr>
+        <w:spacing w:after="40"/>
+      </w:pPr>
+    </w:p>
+    <w:p>
+      <w:pPr>
+        <w:pStyle w:val="Heading2"/>
+      </w:pPr>
+      <w:r>
+        <w:t>G.2 Contadores de la política 3</w:t>
+      </w:r>
+    </w:p>
+    <w:p>
+      <w:pPr>
+        <w:pStyle w:val="Codigo"/>
+      </w:pPr>
+      <w:r>
+        <w:t>FGT-01 # diagnose firewall iprope show 100004 3</w:t>
+      </w:r>
+    </w:p>
+    <w:p>
+      <w:pPr>
+        <w:pStyle w:val="Codigo"/>
+      </w:pPr>
+      <w:r>
+        <w:t>idx:3</w:t>
+      </w:r>
+    </w:p>
+    <w:p>
+      <w:pPr>
+        <w:pStyle w:val="Codigo"/>
+      </w:pPr>
+      <w:r>
+        <w:t>pkts:2 (2 0 0 0 0 0 0 0)</w:t>
+      </w:r>
+    </w:p>
+    <w:p>
+      <w:pPr>
+        <w:pStyle w:val="Codigo"/>
+      </w:pPr>
+      <w:r>
+        <w:t>hit count:2 (2 0 0 0 0 0 0 0)</w:t>
+      </w:r>
+    </w:p>
+    <w:p>
+      <w:pPr>
+        <w:pStyle w:val="Codigo"/>
+      </w:pPr>
+      <w:r>
+        <w:t xml:space="preserve">    first hit:2026-10-27 13:21:36 last hit:2026-10-27 13:21:37</w:t>
+      </w:r>
+    </w:p>
+    <w:p>
+      <w:pPr>
+        <w:pStyle w:val="Codigo"/>
+      </w:pPr>
+      <w:r>
+        <w:t xml:space="preserve"> </w:t>
+      </w:r>
+    </w:p>
+    <w:p>
+      <w:pPr>
+        <w:pStyle w:val="Codigo"/>
+      </w:pPr>
+      <w:r>
+        <w:t>FGT-01 # diagnose firewall iprope6 show 100004 3</w:t>
+      </w:r>
+    </w:p>
+    <w:p>
+      <w:pPr>
+        <w:pStyle w:val="Codigo"/>
+      </w:pPr>
+      <w:r>
+        <w:t>idx:3</w:t>
+      </w:r>
+    </w:p>
+    <w:p>
+      <w:pPr>
+        <w:pStyle w:val="Codigo"/>
+      </w:pPr>
+      <w:r>
+        <w:t>pkts:2 (2 0 0 0 0 0 0 0)</w:t>
+      </w:r>
+    </w:p>
+    <w:p>
+      <w:pPr>
+        <w:pStyle w:val="Codigo"/>
+      </w:pPr>
+      <w:r>
+        <w:t>hit count:2 (2 0 0 0 0 0 0 0)</w:t>
+      </w:r>
+    </w:p>
+    <w:p>
+      <w:pPr>
+        <w:pStyle w:val="Codigo"/>
+      </w:pPr>
+      <w:r>
+        <w:t xml:space="preserve">    first hit:2026-10-27 13:21:27 last hit:2026-10-27 13:21:28</w:t>
+      </w:r>
+    </w:p>
+    <w:p>
+      <w:pPr>
+        <w:spacing w:after="40"/>
+      </w:pPr>
     </w:p>
     <w:sectPr>
       <w:headerReference w:type="default" r:id="rId9"/>

</xml_diff>

<commit_message>
Nombres del grupo y enlace de Drive; gns3ctl multiplataforma con el subcomando todo en lugar del script de PowerShell
</commit_message>
<xml_diff>
--- a/informe/Grupo_05_Proyecto_Parte_I.docx
+++ b/informe/Grupo_05_Proyecto_Parte_I.docx
@@ -113,11 +113,9 @@
       </w:pPr>
       <w:r>
         <w:rPr>
-          <w:b/>
           <w:sz w:val="24"/>
-          <w:highlight w:val="yellow"/>
         </w:rPr>
-        <w:t>[DATO-NOMBRE-1: nombre completo del integrante 1]</w:t>
+        <w:t>Joanfer Hidalgo Chaves</w:t>
       </w:r>
     </w:p>
     <w:p>
@@ -127,11 +125,9 @@
       </w:pPr>
       <w:r>
         <w:rPr>
-          <w:b/>
           <w:sz w:val="24"/>
-          <w:highlight w:val="yellow"/>
         </w:rPr>
-        <w:t>[DATO-NOMBRE-2: nombre completo del integrante 2]</w:t>
+        <w:t>Roy Arias Mejia</w:t>
       </w:r>
     </w:p>
     <w:p>
@@ -141,11 +137,9 @@
       </w:pPr>
       <w:r>
         <w:rPr>
-          <w:b/>
           <w:sz w:val="24"/>
-          <w:highlight w:val="yellow"/>
         </w:rPr>
-        <w:t>[DATO-NOMBRE-3: nombre completo del integrante 3]</w:t>
+        <w:t>Isaac Rodriguez Aguero</w:t>
       </w:r>
     </w:p>
     <w:p>
@@ -155,11 +149,9 @@
       </w:pPr>
       <w:r>
         <w:rPr>
-          <w:b/>
           <w:sz w:val="24"/>
-          <w:highlight w:val="yellow"/>
         </w:rPr>
-        <w:t>[DATO-NOMBRE-4: nombre completo del integrante 4]</w:t>
+        <w:t>Eduardo Canton Grajales</w:t>
       </w:r>
     </w:p>
     <w:p/>
@@ -197,15 +189,7 @@
         <w:rPr>
           <w:sz w:val="22"/>
         </w:rPr>
-        <w:t xml:space="preserve">Proyecto GNS3 descargable: </w:t>
-      </w:r>
-      <w:r>
-        <w:rPr>
-          <w:b/>
-          <w:sz w:val="22"/>
-          <w:highlight w:val="yellow"/>
-        </w:rPr>
-        <w:t>[DATO-ENLACE-1: pegar el enlace de Drive de casoE_v1.gns3project]</w:t>
+        <w:t>Proyecto GNS3 descargable: https://drive.google.com/drive/folders/1mmUOyVEecsfnWPkWwIrvBDGNry5oO2gS?usp=sharing</w:t>
       </w:r>
     </w:p>
     <w:p>
@@ -16791,31 +16775,31 @@
         <w:pStyle w:val="Codigo"/>
       </w:pPr>
       <w:r>
-        <w:t xml:space="preserve">      &lt;li&gt;Integrante 1&lt;/li&gt;</w:t>
-      </w:r>
-    </w:p>
-    <w:p>
-      <w:pPr>
-        <w:pStyle w:val="Codigo"/>
-      </w:pPr>
-      <w:r>
-        <w:t xml:space="preserve">      &lt;li&gt;Integrante 2&lt;/li&gt;</w:t>
-      </w:r>
-    </w:p>
-    <w:p>
-      <w:pPr>
-        <w:pStyle w:val="Codigo"/>
-      </w:pPr>
-      <w:r>
-        <w:t xml:space="preserve">      &lt;li&gt;Integrante 3&lt;/li&gt;</w:t>
-      </w:r>
-    </w:p>
-    <w:p>
-      <w:pPr>
-        <w:pStyle w:val="Codigo"/>
-      </w:pPr>
-      <w:r>
-        <w:t xml:space="preserve">      &lt;li&gt;Integrante 4&lt;/li&gt;</w:t>
+        <w:t xml:space="preserve">      &lt;li&gt;Joanfer Hidalgo Chaves&lt;/li&gt;</w:t>
+      </w:r>
+    </w:p>
+    <w:p>
+      <w:pPr>
+        <w:pStyle w:val="Codigo"/>
+      </w:pPr>
+      <w:r>
+        <w:t xml:space="preserve">      &lt;li&gt;Roy Arias Mejia&lt;/li&gt;</w:t>
+      </w:r>
+    </w:p>
+    <w:p>
+      <w:pPr>
+        <w:pStyle w:val="Codigo"/>
+      </w:pPr>
+      <w:r>
+        <w:t xml:space="preserve">      &lt;li&gt;Isaac Rodriguez Aguero&lt;/li&gt;</w:t>
+      </w:r>
+    </w:p>
+    <w:p>
+      <w:pPr>
+        <w:pStyle w:val="Codigo"/>
+      </w:pPr>
+      <w:r>
+        <w:t xml:space="preserve">      &lt;li&gt;Eduardo Canton Grajales&lt;/li&gt;</w:t>
       </w:r>
     </w:p>
     <w:p>
@@ -17107,17 +17091,7 @@
     </w:p>
     <w:p>
       <w:r>
-        <w:t xml:space="preserve">Enlace de descarga del proyecto exportado sin imágenes propietarias (Archivo, Exportar proyecto): </w:t>
-      </w:r>
-      <w:r>
-        <w:rPr>
-          <w:b/>
-          <w:highlight w:val="yellow"/>
-        </w:rPr>
-        <w:t>[DATO-ENLACE-2: pegar el mismo enlace de Drive]</w:t>
-      </w:r>
-      <w:r>
-        <w:t>.</w:t>
+        <w:t>Enlace de descarga del proyecto exportado sin imágenes propietarias (Archivo, Exportar proyecto): https://drive.google.com/drive/folders/1mmUOyVEecsfnWPkWwIrvBDGNry5oO2gS?usp=sharing.</w:t>
       </w:r>
     </w:p>
     <w:p>

</xml_diff>

<commit_message>
Reemplaza la raya larga por guion en textos, configs y el informe
</commit_message>
<xml_diff>
--- a/informe/Grupo_05_Proyecto_Parte_I.docx
+++ b/informe/Grupo_05_Proyecto_Parte_I.docx
@@ -3661,7 +3661,7 @@
         <w:pStyle w:val="Codigo"/>
       </w:pPr>
       <w:r>
-        <w:t>; Zona g5.eif101o.test — vista EXTERNA (todo lo que no es la red interna)</w:t>
+        <w:t>; Zona g5.eif101o.test - vista EXTERNA (todo lo que no es la red interna)</w:t>
       </w:r>
     </w:p>
     <w:p>
@@ -3839,7 +3839,7 @@
         <w:pStyle w:val="Codigo"/>
       </w:pPr>
       <w:r>
-        <w:t>; Zona g5.eif101o.test — vista INTERNA (LAN y DMZ)</w:t>
+        <w:t>; Zona g5.eif101o.test - vista INTERNA (LAN y DMZ)</w:t>
       </w:r>
     </w:p>
     <w:p>
@@ -4057,7 +4057,7 @@
         <w:pStyle w:val="Codigo"/>
       </w:pPr>
       <w:r>
-        <w:t xml:space="preserve">    &lt;p&gt;Caso E — DMZ corporativa protegida&lt;/p&gt;</w:t>
+        <w:t xml:space="preserve">    &lt;p&gt;Caso E - DMZ corporativa protegida&lt;/p&gt;</w:t>
       </w:r>
     </w:p>
     <w:p>
@@ -11337,7 +11337,7 @@
         <w:pStyle w:val="Codigo"/>
       </w:pPr>
       <w:r>
-        <w:t>! R-ISP — Simula Internet: redes externas A y B, estáticas hacia la empresa</w:t>
+        <w:t>! R-ISP - Simula Internet: redes externas A y B, estáticas hacia la empresa</w:t>
       </w:r>
     </w:p>
     <w:p>
@@ -11793,7 +11793,7 @@
         <w:pStyle w:val="Codigo"/>
       </w:pPr>
       <w:r>
-        <w:t>! E10 — origen falsificado:</w:t>
+        <w:t>! E10 - origen falsificado:</w:t>
       </w:r>
     </w:p>
     <w:p>
@@ -11841,7 +11841,7 @@
         <w:pStyle w:val="Codigo"/>
       </w:pPr>
       <w:r>
-        <w:t>! E02b — ruta filtrada hacia la LAN (junto con la de R-EDGE):</w:t>
+        <w:t>! E02b - ruta filtrada hacia la LAN (junto con la de R-EDGE):</w:t>
       </w:r>
     </w:p>
     <w:p>
@@ -11894,7 +11894,7 @@
         <w:pStyle w:val="Codigo"/>
       </w:pPr>
       <w:r>
-        <w:t>! R-EDGE — Borde de la empresa: ACL-BORDE-IN, estáticas, vty sin acceso (solo consola)</w:t>
+        <w:t>! R-EDGE - Borde de la empresa: ACL-BORDE-IN, estáticas, vty sin acceso (solo consola)</w:t>
       </w:r>
     </w:p>
     <w:p>
@@ -12646,7 +12646,7 @@
         <w:pStyle w:val="Codigo"/>
       </w:pPr>
       <w:r>
-        <w:t>! E02b — ruta filtrada hacia la LAN (junto con la de R-ISP):</w:t>
+        <w:t>! E02b - ruta filtrada hacia la LAN (junto con la de R-ISP):</w:t>
       </w:r>
     </w:p>
     <w:p>
@@ -12731,7 +12731,7 @@
         <w:pStyle w:val="Codigo"/>
       </w:pPr>
       <w:r>
-        <w:t>! R-LAN — Router interno: subinterfaces VLAN 10/20, OSPFv2/OSPFv3, ACL-SEG-USUARIOS, ACL-VTY-ADMIN</w:t>
+        <w:t>! R-LAN - Router interno: subinterfaces VLAN 10/20, OSPFv2/OSPFv3, ACL-SEG-USUARIOS, ACL-VTY-ADMIN</w:t>
       </w:r>
     </w:p>
     <w:p>
@@ -15661,7 +15661,7 @@
         <w:pStyle w:val="Codigo"/>
       </w:pPr>
       <w:r>
-        <w:t>// SRV-DMZ — bind9 autoritativo de g5.eif101o.test (IPv4 e IPv6)</w:t>
+        <w:t>// SRV-DMZ - bind9 autoritativo de g5.eif101o.test (IPv4 e IPv6)</w:t>
       </w:r>
     </w:p>
     <w:p>
@@ -16122,7 +16122,7 @@
         <w:pStyle w:val="Codigo"/>
       </w:pPr>
       <w:r>
-        <w:t># SRV-DMZ — nginx para www, v4 y v6.g5.eif101o.test (IPv4 e IPv6)</w:t>
+        <w:t># SRV-DMZ - nginx para www, v4 y v6.g5.eif101o.test (IPv4 e IPv6)</w:t>
       </w:r>
     </w:p>
     <w:p>
@@ -16583,7 +16583,7 @@
         <w:pStyle w:val="Codigo"/>
       </w:pPr>
       <w:r>
-        <w:t xml:space="preserve">    &lt;p&gt;Caso E — DMZ corporativa protegida&lt;/p&gt;</w:t>
+        <w:t xml:space="preserve">    &lt;p&gt;Caso E - DMZ corporativa protegida&lt;/p&gt;</w:t>
       </w:r>
     </w:p>
     <w:p>

</xml_diff>

<commit_message>
Quita el nombre de fantasia del grupo de la pagina, el informe, el README y la licencia
El grupo queda identificado como Grupo 5 (Grupo 05 en la licencia). Se actualiza el titulo de servicios/web/index.html, el encabezado, la portada y el autor del informe (docx y construir_informe.py), el README, la especificacion y el LICENSE.
</commit_message>
<xml_diff>
--- a/informe/Grupo_05_Proyecto_Parte_I.docx
+++ b/informe/Grupo_05_Proyecto_Parte_I.docx
@@ -103,7 +103,7 @@
           <w:b/>
           <w:sz w:val="26"/>
         </w:rPr>
-        <w:t>Grupo 5, Los Arepísticos</w:t>
+        <w:t>Grupo 5</w:t>
       </w:r>
     </w:p>
     <w:p>
@@ -4049,7 +4049,7 @@
         <w:pStyle w:val="Codigo"/>
       </w:pPr>
       <w:r>
-        <w:t xml:space="preserve">    &lt;h1&gt;Grupo 5 · Los Arepísticos&lt;/h1&gt;</w:t>
+        <w:t xml:space="preserve">    &lt;h1&gt;Grupo 5&lt;/h1&gt;</w:t>
       </w:r>
     </w:p>
     <w:p>
@@ -16575,7 +16575,7 @@
         <w:pStyle w:val="Codigo"/>
       </w:pPr>
       <w:r>
-        <w:t xml:space="preserve">    &lt;h1&gt;Grupo 5 · Los Arepísticos&lt;/h1&gt;</w:t>
+        <w:t xml:space="preserve">    &lt;h1&gt;Grupo 5&lt;/h1&gt;</w:t>
       </w:r>
     </w:p>
     <w:p>
@@ -19622,7 +19622,7 @@
       <w:rPr>
         <w:sz w:val="17"/>
       </w:rPr>
-      <w:t>Caso E: DMZ corporativa protegida | Grupo 5, Los Arepísticos | Redes Avanzadas I</w:t>
+      <w:t>Caso E: DMZ corporativa protegida | Grupo 5 | Redes Avanzadas I</w:t>
     </w:r>
   </w:p>
 </w:hdr>

</xml_diff>

<commit_message>
feat(maqueta): pc-admin y pc-user usan la imagen webterm con firefox
</commit_message>
<xml_diff>
--- a/informe/Grupo_05_Proyecto_Parte_I.docx
+++ b/informe/Grupo_05_Proyecto_Parte_I.docx
@@ -1555,7 +1555,7 @@
               <w:rPr>
                 <w:sz w:val="18"/>
               </w:rPr>
-              <w:t>Contenedor Alpine</w:t>
+              <w:t>Contenedor Debian con terminal y navegador</w:t>
             </w:r>
           </w:p>
         </w:tc>
@@ -1628,7 +1628,7 @@
               <w:rPr>
                 <w:sz w:val="18"/>
               </w:rPr>
-              <w:t>Contenedor con terminal y navegador</w:t>
+              <w:t>Contenedor Debian con terminal y navegador</w:t>
             </w:r>
           </w:p>
         </w:tc>
@@ -9325,7 +9325,7 @@
               <w:rPr>
                 <w:sz w:val="19"/>
               </w:rPr>
-              <w:t xml:space="preserve"> PC-ADMIN, navegador web, hacia la GUI de FGT-01 (https://10.50.1.49, IP de port2)</w:t>
+              <w:t xml:space="preserve"> PC-ADMIN, Firefox en la consola gráfica (VNC) del nodo, hacia la GUI de FGT-01 (https://10.50.1.49, IP de port2)</w:t>
             </w:r>
           </w:p>
           <w:p>
@@ -10509,7 +10509,7 @@
               <w:rPr>
                 <w:sz w:val="19"/>
               </w:rPr>
-              <w:t xml:space="preserve"> PC-ADMIN, navegador web; y consola de PC-USER para el segundo comando</w:t>
+              <w:t xml:space="preserve"> PC-ADMIN, Firefox en la consola gráfica (VNC) del nodo; y la consola auxiliar (terminal) de PC-USER para el segundo comando</w:t>
             </w:r>
           </w:p>
           <w:p>
@@ -10739,7 +10739,7 @@
     </w:p>
     <w:p>
       <w:r>
-        <w:t xml:space="preserve">Al configurar PC-USER con una dirección fija IPv4 y un bloque </w:t>
+        <w:t xml:space="preserve">Al configurar PC-USER, que entonces usaba una imagen Alpine, con una dirección fija IPv4 y un bloque </w:t>
       </w:r>
       <w:r>
         <w:rPr>
@@ -10779,7 +10779,7 @@
         <w:t>accept_ra</w:t>
       </w:r>
       <w:r>
-        <w:t>).</w:t>
+        <w:t>). Al pasar después PC-USER a una imagen Debian se conservó la configuración y SLAAC siguió funcionando.</w:t>
       </w:r>
     </w:p>
     <w:p>
@@ -10836,6 +10836,29 @@
       </w:r>
       <w:r>
         <w:t xml:space="preserve"> los traduce al cargarlos; la cabecera de cada archivo lo explica, y quien pegue las configuraciones a mano debe usar el nombre real del equipo. La matriz anota el nombre real.</w:t>
+      </w:r>
+    </w:p>
+    <w:p>
+      <w:pPr>
+        <w:pStyle w:val="Heading3"/>
+      </w:pPr>
+      <w:r>
+        <w:t>Incidencia 6: PC-ADMIN no tenía navegador</w:t>
+      </w:r>
+    </w:p>
+    <w:p>
+      <w:r>
+        <w:t xml:space="preserve">El diseño pedía en PC-ADMIN un terminal y un navegador para abrir la GUI del FortiGate, pero la plantilla Ubuntu Docker Guest que se había elegido solo trae terminal. Como todas las pruebas automáticas usan curl y ssh, nadie lo notó hasta intentar abrir la GUI. Se construyó la imagen </w:t>
+      </w:r>
+      <w:r>
+        <w:rPr>
+          <w:rFonts w:ascii="Consolas" w:hAnsi="Consolas" w:cs="Consolas" w:eastAsia="Consolas"/>
+          <w:sz w:val="20"/>
+        </w:rPr>
+        <w:t>caso-e/webterm</w:t>
+      </w:r>
+      <w:r>
+        <w:t>, que parte de gns3/webterm (Debian con Firefox por VNC) y le suma dnsutils y netcat para que las pruebas sigan corriendo; el terminal queda en la consola auxiliar del nodo. PC-ADMIN y PC-USER usan ahora esa imagen, con la misma red y las mismas direcciones, y la prueba E13 (GUI desde PC-ADMIN sí, desde PC-USER no) se repitió con el resultado anterior.</w:t>
       </w:r>
     </w:p>
     <w:p>

</xml_diff>